<commit_message>
Inclui repetição em contêiner (E1 a E3) no TCC
Co-Authored-By: Claude Sonnet 5.5 <noreply@anthropic.com>
Claude-Session: https://claude.ai/code/session_012LNMSWELRzEdaC79pJJD6f
</commit_message>
<xml_diff>
--- a/docs/tcc/saida/TCC_Plataforma_Telemetria_OBD-II.docx
+++ b/docs/tcc/saida/TCC_Plataforma_Telemetria_OBD-II.docx
@@ -1249,7 +1249,7 @@
         <w:ind w:left="0" w:right="567" w:hanging="0"/>
       </w:pPr>
       <w:r>
-        <w:t xml:space="preserve">Tabela 26: Atendimento aos requisitos</w:t>
+        <w:t xml:space="preserve">Tabela 26: Execução original e repetição em contêiner isolado (E1 a E3, mesma máquina)</w:t>
       </w:r>
       <w:r>
         <w:tab/>
@@ -1267,13 +1267,13 @@
         <w:ind w:left="0" w:right="567" w:hanging="0"/>
       </w:pPr>
       <w:r>
-        <w:t xml:space="preserve">Tabela 27: Origem dos números do Capítulo 5</w:t>
+        <w:t xml:space="preserve">Tabela 27: Atendimento aos requisitos</w:t>
       </w:r>
       <w:r>
         <w:tab/>
       </w:r>
       <w:r>
-        <w:t>77</w:t>
+        <w:t>67</w:t>
       </w:r>
     </w:p>
     <w:p>
@@ -1285,13 +1285,13 @@
         <w:ind w:left="0" w:right="567" w:hanging="0"/>
       </w:pPr>
       <w:r>
-        <w:t xml:space="preserve">Tabela 28: Sessão ELM327 capturada contra o simulador</w:t>
+        <w:t xml:space="preserve">Tabela 28: Origem dos números do Capítulo 5</w:t>
       </w:r>
       <w:r>
         <w:tab/>
       </w:r>
       <w:r>
-        <w:t>81</w:t>
+        <w:t>78</w:t>
       </w:r>
     </w:p>
     <w:p>
@@ -1303,13 +1303,31 @@
         <w:ind w:left="0" w:right="567" w:hanging="0"/>
       </w:pPr>
       <w:r>
-        <w:t xml:space="preserve">Tabela 29: Decisões de projeto selecionadas</w:t>
+        <w:t xml:space="preserve">Tabela 29: Sessão ELM327 capturada contra o simulador</w:t>
       </w:r>
       <w:r>
         <w:tab/>
       </w:r>
       <w:r>
         <w:t>82</w:t>
+      </w:r>
+    </w:p>
+    <w:p>
+      <w:pPr>
+        <w:pStyle w:val="ItemLista"/>
+        <w:tabs>
+          <w:tab w:val="right" w:leader="dot" w:pos="9071"/>
+        </w:tabs>
+        <w:ind w:left="0" w:right="567" w:hanging="0"/>
+      </w:pPr>
+      <w:r>
+        <w:t xml:space="preserve">Tabela 30: Decisões de projeto selecionadas</w:t>
+      </w:r>
+      <w:r>
+        <w:tab/>
+      </w:r>
+      <w:r>
+        <w:t>83</w:t>
       </w:r>
     </w:p>
     <w:p>
@@ -5197,7 +5215,7 @@
         <w:tab/>
       </w:r>
       <w:r>
-        <w:t>66</w:t>
+        <w:t>67</w:t>
       </w:r>
     </w:p>
     <w:p>
@@ -5233,7 +5251,7 @@
         <w:tab/>
       </w:r>
       <w:r>
-        <w:t>68</w:t>
+        <w:t>69</w:t>
       </w:r>
     </w:p>
     <w:p>
@@ -5251,7 +5269,7 @@
         <w:tab/>
       </w:r>
       <w:r>
-        <w:t>68</w:t>
+        <w:t>69</w:t>
       </w:r>
     </w:p>
     <w:p>
@@ -5269,7 +5287,7 @@
         <w:tab/>
       </w:r>
       <w:r>
-        <w:t>69</w:t>
+        <w:t>70</w:t>
       </w:r>
     </w:p>
     <w:p>
@@ -5287,7 +5305,7 @@
         <w:tab/>
       </w:r>
       <w:r>
-        <w:t>69</w:t>
+        <w:t>70</w:t>
       </w:r>
     </w:p>
     <w:p>
@@ -5305,7 +5323,7 @@
         <w:tab/>
       </w:r>
       <w:r>
-        <w:t>70</w:t>
+        <w:t>71</w:t>
       </w:r>
     </w:p>
     <w:p>
@@ -5323,7 +5341,7 @@
         <w:tab/>
       </w:r>
       <w:r>
-        <w:t>70</w:t>
+        <w:t>71</w:t>
       </w:r>
     </w:p>
     <w:p>
@@ -5341,7 +5359,7 @@
         <w:tab/>
       </w:r>
       <w:r>
-        <w:t>71</w:t>
+        <w:t>72</w:t>
       </w:r>
     </w:p>
     <w:p>
@@ -5359,7 +5377,7 @@
         <w:tab/>
       </w:r>
       <w:r>
-        <w:t>72</w:t>
+        <w:t>73</w:t>
       </w:r>
     </w:p>
     <w:p>
@@ -5377,7 +5395,7 @@
         <w:tab/>
       </w:r>
       <w:r>
-        <w:t>73</w:t>
+        <w:t>74</w:t>
       </w:r>
     </w:p>
     <w:p>
@@ -5395,7 +5413,7 @@
         <w:tab/>
       </w:r>
       <w:r>
-        <w:t>77</w:t>
+        <w:t>78</w:t>
       </w:r>
     </w:p>
     <w:p>
@@ -5413,7 +5431,7 @@
         <w:tab/>
       </w:r>
       <w:r>
-        <w:t>79</w:t>
+        <w:t>80</w:t>
       </w:r>
     </w:p>
     <w:p>
@@ -5431,7 +5449,7 @@
         <w:tab/>
       </w:r>
       <w:r>
-        <w:t>79</w:t>
+        <w:t>80</w:t>
       </w:r>
     </w:p>
     <w:p>
@@ -5449,7 +5467,7 @@
         <w:tab/>
       </w:r>
       <w:r>
-        <w:t>79</w:t>
+        <w:t>80</w:t>
       </w:r>
     </w:p>
     <w:p>
@@ -5467,7 +5485,7 @@
         <w:tab/>
       </w:r>
       <w:r>
-        <w:t>79</w:t>
+        <w:t>80</w:t>
       </w:r>
     </w:p>
     <w:p>
@@ -5485,7 +5503,7 @@
         <w:tab/>
       </w:r>
       <w:r>
-        <w:t>79</w:t>
+        <w:t>80</w:t>
       </w:r>
     </w:p>
     <w:p>
@@ -5503,7 +5521,7 @@
         <w:tab/>
       </w:r>
       <w:r>
-        <w:t>80</w:t>
+        <w:t>81</w:t>
       </w:r>
     </w:p>
     <w:p>
@@ -5521,7 +5539,7 @@
         <w:tab/>
       </w:r>
       <w:r>
-        <w:t>81</w:t>
+        <w:t>82</w:t>
       </w:r>
     </w:p>
     <w:p>
@@ -5539,7 +5557,7 @@
         <w:tab/>
       </w:r>
       <w:r>
-        <w:t>82</w:t>
+        <w:t>83</w:t>
       </w:r>
     </w:p>
     <w:p>
@@ -6403,7 +6421,7 @@
         <w:pStyle w:val="FirstParagraph"/>
       </w:pPr>
       <w:r>
-        <w:t xml:space="preserve">Todas as medições deste texto vêm de um único computador, descrito na Seção 4.10. Não há segunda máquina medida, e o trabalho declara essa limitação em vez de supor reprodutibilidade entre máquinas. A repetição por outra pessoa é possível e está documentada (Apêndice B), mas não foi executada.</w:t>
+        <w:t xml:space="preserve">Todas as medições deste texto vêm de um único computador, descrito na Seção 4.10. Não há segunda máquina medida, e o trabalho declara essa limitação em vez de supor reprodutibilidade entre máquinas. Uma repetição dos ensaios E1 a E3 em contêiner Docker isolado, no mesmo computador, foi feita e está na Seção 5.9; a repetição por outra pessoa, em outra máquina, está documentada (Apêndice B), mas não foi executada.</w:t>
       </w:r>
     </w:p>
     <w:bookmarkEnd w:id="27"/>
@@ -24613,7 +24631,7 @@
         <w:t xml:space="preserve"> </w:t>
       </w:r>
       <w:r>
-        <w:t xml:space="preserve">A repetição dos ensaios em uma segunda máquina, prevista originalmente no RNF05, não foi realizada. As instruções para repeti-la, inclusive dentro de um contêiner Docker isolado, estão no Apêndice B. Uma repetição em contêiner na mesma máquina verificaria o isolamento e a facilidade de instalação, mas não substituiria uma segunda máquina, e seria descrita como repetição em ambiente isolado, e não como reprodução independente.</w:t>
+        <w:t xml:space="preserve">A repetição dos ensaios em uma segunda máquina, prevista originalmente no RNF05, não foi realizada. Foi feita, porém, uma repetição dos ensaios E1, E2 e E3 em um contêiner Docker isolado (imagem de desenvolvimento do projeto, com as dependências instaladas na hora), no mesmo computador, com os mesmos parâmetros e sementes; seus resultados estão na Seção 5.9. Ela verifica o isolamento e a facilidade de instalação e dá uma ideia da variação entre execuções, mas, como os ensaios originais também rodaram em contêiner Linux sobre WSL2 nesse computador, não é uma reprodução independente. As instruções para repetir em outra máquina estão no Apêndice B.</w:t>
       </w:r>
     </w:p>
     <w:bookmarkEnd w:id="103"/>
@@ -35983,7 +36001,1267 @@
         <w:t xml:space="preserve"> </w:t>
       </w:r>
       <w:r>
-        <w:t xml:space="preserve">Ciclo, RTT e latência dependem de relógio real, do sistema operacional e da CPU, e não são reproduzidos bit a bit. Os números deste capítulo vêm de uma única execução de cada ensaio em uma única máquina (contêiner Linux sobre WSL2, 32 núcleos lógicos, Python 3.12.15). Como não há repetições independentes, não há como estimar a variação entre execuções; os desvios padrão reportados são dentro de uma execução. A repetição em uma segunda máquina, prevista no requisito RNF05, não foi feita e é um trabalho pendente (Apêndice B).</w:t>
+        <w:t xml:space="preserve">Ciclo, RTT e latência dependem de relógio real, do sistema operacional e da CPU, e não são reproduzidos bit a bit. Os números das seções anteriores vêm de uma execução de cada ensaio em um computador (contêiner Linux sobre WSL2, 32 núcleos lógicos, Python 3.12.15). Para ter uma noção da variação entre execuções, os autores repetiram os ensaios E1, E2 e E3 em um novo contêiner Docker (imagem de desenvolvimento do projeto, dependências instaladas no início da execução), no mesmo computador, com os mesmos parâmetros e sementes. A Tabela 26 compara as duas execuções.</w:t>
+      </w:r>
+    </w:p>
+    <w:p>
+      <w:pPr>
+        <w:pStyle w:val="LegendaTabela"/>
+      </w:pPr>
+      <w:r>
+        <w:t xml:space="preserve">Tabela 26: Execução original e repetição em contêiner isolado (E1 a E3, mesma máquina)</w:t>
+      </w:r>
+    </w:p>
+    <w:tbl>
+      <w:tblPr>
+        <w:tblStyle w:val="Table"/>
+        <w:jc w:val="center"/>
+        <w:tblLayout w:type="fixed"/>
+        <w:tblLook w:firstRow="1" w:lastRow="0" w:firstColumn="0" w:lastColumn="0" w:noHBand="0" w:noVBand="0" w:val="0020"/>
+        <w:tblW w:w="9069" w:type="dxa"/>
+        <w:tblLayout w:type="fixed"/>
+        <w:tblBorders>
+          <w:top w:val="single" w:sz="4" w:color="808080"/>
+          <w:left w:val="nil"/>
+          <w:bottom w:val="single" w:sz="4" w:color="808080"/>
+          <w:right w:val="nil"/>
+          <w:insideH w:val="single" w:sz="4" w:color="808080"/>
+          <w:insideV w:val="nil"/>
+        </w:tblBorders>
+      </w:tblPr>
+      <w:tblGrid>
+        <w:gridCol w:w="5663"/>
+        <w:gridCol w:w="1612"/>
+        <w:gridCol w:w="1794"/>
+      </w:tblGrid>
+      <w:tr>
+        <w:trPr>
+          <w:tblHeader w:val="true"/>
+          <w:tblHeader/>
+          <w:cantSplit/>
+        </w:trPr>
+        <w:tc>
+          <w:tcPr>
+            <w:tcW w:w="5663" w:type="dxa"/>
+            <w:shd w:val="clear" w:fill="E7E6E6"/>
+            <w:tcMar>
+              <w:top w:w="40" w:type="dxa"/>
+              <w:bottom w:w="40" w:type="dxa"/>
+              <w:left w:w="70" w:type="dxa"/>
+              <w:right w:w="70" w:type="dxa"/>
+            </w:tcMar>
+          </w:tcPr>
+          <w:p>
+            <w:pPr>
+              <w:pStyle w:val="Compact"/>
+              <w:spacing w:line="240" w:lineRule="auto" w:before="0" w:after="0"/>
+              <w:ind w:firstLine="0"/>
+              <w:jc w:val="left"/>
+            </w:pPr>
+            <w:r>
+              <w:rPr>
+                <w:rFonts w:ascii="Arial" w:hAnsi="Arial"/>
+                <w:b/>
+                <w:sz w:val="18"/>
+              </w:rPr>
+              <w:t xml:space="preserve">Medida</w:t>
+            </w:r>
+          </w:p>
+        </w:tc>
+        <w:tc>
+          <w:tcPr>
+            <w:tcW w:w="1612" w:type="dxa"/>
+            <w:shd w:val="clear" w:fill="E7E6E6"/>
+            <w:tcMar>
+              <w:top w:w="40" w:type="dxa"/>
+              <w:bottom w:w="40" w:type="dxa"/>
+              <w:left w:w="70" w:type="dxa"/>
+              <w:right w:w="70" w:type="dxa"/>
+            </w:tcMar>
+          </w:tcPr>
+          <w:p>
+            <w:pPr>
+              <w:pStyle w:val="Compact"/>
+              <w:spacing w:line="240" w:lineRule="auto" w:before="0" w:after="0"/>
+              <w:ind w:firstLine="0"/>
+              <w:jc w:val="left"/>
+            </w:pPr>
+            <w:r>
+              <w:rPr>
+                <w:rFonts w:ascii="Arial" w:hAnsi="Arial"/>
+                <w:b/>
+                <w:sz w:val="18"/>
+              </w:rPr>
+              <w:t xml:space="preserve">Original</w:t>
+            </w:r>
+          </w:p>
+        </w:tc>
+        <w:tc>
+          <w:tcPr>
+            <w:tcW w:w="1794" w:type="dxa"/>
+            <w:shd w:val="clear" w:fill="E7E6E6"/>
+            <w:tcMar>
+              <w:top w:w="40" w:type="dxa"/>
+              <w:bottom w:w="40" w:type="dxa"/>
+              <w:left w:w="70" w:type="dxa"/>
+              <w:right w:w="70" w:type="dxa"/>
+            </w:tcMar>
+          </w:tcPr>
+          <w:p>
+            <w:pPr>
+              <w:pStyle w:val="Compact"/>
+              <w:spacing w:line="240" w:lineRule="auto" w:before="0" w:after="0"/>
+              <w:ind w:firstLine="0"/>
+              <w:jc w:val="left"/>
+            </w:pPr>
+            <w:r>
+              <w:rPr>
+                <w:rFonts w:ascii="Arial" w:hAnsi="Arial"/>
+                <w:b/>
+                <w:sz w:val="18"/>
+              </w:rPr>
+              <w:t xml:space="preserve">Repetição</w:t>
+            </w:r>
+          </w:p>
+        </w:tc>
+      </w:tr>
+      <w:tr>
+        <w:trPr>
+          <w:cantSplit/>
+        </w:trPr>
+        <w:tc>
+          <w:tcPr>
+            <w:tcW w:w="5663" w:type="dxa"/>
+            <w:tcMar>
+              <w:top w:w="40" w:type="dxa"/>
+              <w:bottom w:w="40" w:type="dxa"/>
+              <w:left w:w="70" w:type="dxa"/>
+              <w:right w:w="70" w:type="dxa"/>
+            </w:tcMar>
+          </w:tcPr>
+          <w:p>
+            <w:pPr>
+              <w:pStyle w:val="Compact"/>
+              <w:spacing w:line="240" w:lineRule="auto" w:before="0" w:after="0"/>
+              <w:ind w:firstLine="0"/>
+              <w:jc w:val="left"/>
+            </w:pPr>
+            <w:r>
+              <w:rPr>
+                <w:rFonts w:ascii="Arial" w:hAnsi="Arial"/>
+                <w:sz w:val="18"/>
+              </w:rPr>
+              <w:t xml:space="preserve">E1: ciclo p95 (ms)</w:t>
+            </w:r>
+          </w:p>
+        </w:tc>
+        <w:tc>
+          <w:tcPr>
+            <w:tcW w:w="1612" w:type="dxa"/>
+            <w:tcMar>
+              <w:top w:w="40" w:type="dxa"/>
+              <w:bottom w:w="40" w:type="dxa"/>
+              <w:left w:w="70" w:type="dxa"/>
+              <w:right w:w="70" w:type="dxa"/>
+            </w:tcMar>
+          </w:tcPr>
+          <w:p>
+            <w:pPr>
+              <w:pStyle w:val="Compact"/>
+              <w:spacing w:line="240" w:lineRule="auto" w:before="0" w:after="0"/>
+              <w:ind w:firstLine="0"/>
+              <w:jc w:val="left"/>
+            </w:pPr>
+            <w:r>
+              <w:rPr>
+                <w:rFonts w:ascii="Arial" w:hAnsi="Arial"/>
+                <w:sz w:val="18"/>
+              </w:rPr>
+              <w:t xml:space="preserve">115,6</w:t>
+            </w:r>
+          </w:p>
+        </w:tc>
+        <w:tc>
+          <w:tcPr>
+            <w:tcW w:w="1794" w:type="dxa"/>
+            <w:tcMar>
+              <w:top w:w="40" w:type="dxa"/>
+              <w:bottom w:w="40" w:type="dxa"/>
+              <w:left w:w="70" w:type="dxa"/>
+              <w:right w:w="70" w:type="dxa"/>
+            </w:tcMar>
+          </w:tcPr>
+          <w:p>
+            <w:pPr>
+              <w:pStyle w:val="Compact"/>
+              <w:spacing w:line="240" w:lineRule="auto" w:before="0" w:after="0"/>
+              <w:ind w:firstLine="0"/>
+              <w:jc w:val="left"/>
+            </w:pPr>
+            <w:r>
+              <w:rPr>
+                <w:rFonts w:ascii="Arial" w:hAnsi="Arial"/>
+                <w:sz w:val="18"/>
+              </w:rPr>
+              <w:t xml:space="preserve">115,8</w:t>
+            </w:r>
+          </w:p>
+        </w:tc>
+      </w:tr>
+      <w:tr>
+        <w:trPr>
+          <w:cantSplit/>
+        </w:trPr>
+        <w:tc>
+          <w:tcPr>
+            <w:tcW w:w="5663" w:type="dxa"/>
+            <w:tcMar>
+              <w:top w:w="40" w:type="dxa"/>
+              <w:bottom w:w="40" w:type="dxa"/>
+              <w:left w:w="70" w:type="dxa"/>
+              <w:right w:w="70" w:type="dxa"/>
+            </w:tcMar>
+          </w:tcPr>
+          <w:p>
+            <w:pPr>
+              <w:pStyle w:val="Compact"/>
+              <w:spacing w:line="240" w:lineRule="auto" w:before="0" w:after="0"/>
+              <w:ind w:firstLine="0"/>
+              <w:jc w:val="left"/>
+            </w:pPr>
+            <w:r>
+              <w:rPr>
+                <w:rFonts w:ascii="Arial" w:hAnsi="Arial"/>
+                <w:sz w:val="18"/>
+              </w:rPr>
+              <w:t xml:space="preserve">E1: RTT p95 (ms)</w:t>
+            </w:r>
+          </w:p>
+        </w:tc>
+        <w:tc>
+          <w:tcPr>
+            <w:tcW w:w="1612" w:type="dxa"/>
+            <w:tcMar>
+              <w:top w:w="40" w:type="dxa"/>
+              <w:bottom w:w="40" w:type="dxa"/>
+              <w:left w:w="70" w:type="dxa"/>
+              <w:right w:w="70" w:type="dxa"/>
+            </w:tcMar>
+          </w:tcPr>
+          <w:p>
+            <w:pPr>
+              <w:pStyle w:val="Compact"/>
+              <w:spacing w:line="240" w:lineRule="auto" w:before="0" w:after="0"/>
+              <w:ind w:firstLine="0"/>
+              <w:jc w:val="left"/>
+            </w:pPr>
+            <w:r>
+              <w:rPr>
+                <w:rFonts w:ascii="Arial" w:hAnsi="Arial"/>
+                <w:sz w:val="18"/>
+              </w:rPr>
+              <w:t xml:space="preserve">13,5</w:t>
+            </w:r>
+          </w:p>
+        </w:tc>
+        <w:tc>
+          <w:tcPr>
+            <w:tcW w:w="1794" w:type="dxa"/>
+            <w:tcMar>
+              <w:top w:w="40" w:type="dxa"/>
+              <w:bottom w:w="40" w:type="dxa"/>
+              <w:left w:w="70" w:type="dxa"/>
+              <w:right w:w="70" w:type="dxa"/>
+            </w:tcMar>
+          </w:tcPr>
+          <w:p>
+            <w:pPr>
+              <w:pStyle w:val="Compact"/>
+              <w:spacing w:line="240" w:lineRule="auto" w:before="0" w:after="0"/>
+              <w:ind w:firstLine="0"/>
+              <w:jc w:val="left"/>
+            </w:pPr>
+            <w:r>
+              <w:rPr>
+                <w:rFonts w:ascii="Arial" w:hAnsi="Arial"/>
+                <w:sz w:val="18"/>
+              </w:rPr>
+              <w:t xml:space="preserve">13,5</w:t>
+            </w:r>
+          </w:p>
+        </w:tc>
+      </w:tr>
+      <w:tr>
+        <w:trPr>
+          <w:cantSplit/>
+        </w:trPr>
+        <w:tc>
+          <w:tcPr>
+            <w:tcW w:w="5663" w:type="dxa"/>
+            <w:tcMar>
+              <w:top w:w="40" w:type="dxa"/>
+              <w:bottom w:w="40" w:type="dxa"/>
+              <w:left w:w="70" w:type="dxa"/>
+              <w:right w:w="70" w:type="dxa"/>
+            </w:tcMar>
+          </w:tcPr>
+          <w:p>
+            <w:pPr>
+              <w:pStyle w:val="Compact"/>
+              <w:spacing w:line="240" w:lineRule="auto" w:before="0" w:after="0"/>
+              <w:ind w:firstLine="0"/>
+              <w:jc w:val="left"/>
+            </w:pPr>
+            <w:r>
+              <w:rPr>
+                <w:rFonts w:ascii="Arial" w:hAnsi="Arial"/>
+                <w:sz w:val="18"/>
+              </w:rPr>
+              <w:t xml:space="preserve">E1: latência coletor ao banco p95 (ms)</w:t>
+            </w:r>
+          </w:p>
+        </w:tc>
+        <w:tc>
+          <w:tcPr>
+            <w:tcW w:w="1612" w:type="dxa"/>
+            <w:tcMar>
+              <w:top w:w="40" w:type="dxa"/>
+              <w:bottom w:w="40" w:type="dxa"/>
+              <w:left w:w="70" w:type="dxa"/>
+              <w:right w:w="70" w:type="dxa"/>
+            </w:tcMar>
+          </w:tcPr>
+          <w:p>
+            <w:pPr>
+              <w:pStyle w:val="Compact"/>
+              <w:spacing w:line="240" w:lineRule="auto" w:before="0" w:after="0"/>
+              <w:ind w:firstLine="0"/>
+              <w:jc w:val="left"/>
+            </w:pPr>
+            <w:r>
+              <w:rPr>
+                <w:rFonts w:ascii="Arial" w:hAnsi="Arial"/>
+                <w:sz w:val="18"/>
+              </w:rPr>
+              <w:t xml:space="preserve">3,5</w:t>
+            </w:r>
+          </w:p>
+        </w:tc>
+        <w:tc>
+          <w:tcPr>
+            <w:tcW w:w="1794" w:type="dxa"/>
+            <w:tcMar>
+              <w:top w:w="40" w:type="dxa"/>
+              <w:bottom w:w="40" w:type="dxa"/>
+              <w:left w:w="70" w:type="dxa"/>
+              <w:right w:w="70" w:type="dxa"/>
+            </w:tcMar>
+          </w:tcPr>
+          <w:p>
+            <w:pPr>
+              <w:pStyle w:val="Compact"/>
+              <w:spacing w:line="240" w:lineRule="auto" w:before="0" w:after="0"/>
+              <w:ind w:firstLine="0"/>
+              <w:jc w:val="left"/>
+            </w:pPr>
+            <w:r>
+              <w:rPr>
+                <w:rFonts w:ascii="Arial" w:hAnsi="Arial"/>
+                <w:sz w:val="18"/>
+              </w:rPr>
+              <w:t xml:space="preserve">3,8</w:t>
+            </w:r>
+          </w:p>
+        </w:tc>
+      </w:tr>
+      <w:tr>
+        <w:trPr>
+          <w:cantSplit/>
+        </w:trPr>
+        <w:tc>
+          <w:tcPr>
+            <w:tcW w:w="5663" w:type="dxa"/>
+            <w:tcMar>
+              <w:top w:w="40" w:type="dxa"/>
+              <w:bottom w:w="40" w:type="dxa"/>
+              <w:left w:w="70" w:type="dxa"/>
+              <w:right w:w="70" w:type="dxa"/>
+            </w:tcMar>
+          </w:tcPr>
+          <w:p>
+            <w:pPr>
+              <w:pStyle w:val="Compact"/>
+              <w:spacing w:line="240" w:lineRule="auto" w:before="0" w:after="0"/>
+              <w:ind w:firstLine="0"/>
+              <w:jc w:val="left"/>
+            </w:pPr>
+            <w:r>
+              <w:rPr>
+                <w:rFonts w:ascii="Arial" w:hAnsi="Arial"/>
+                <w:sz w:val="18"/>
+              </w:rPr>
+              <w:t xml:space="preserve">E1: detecção da P0300 (s)</w:t>
+            </w:r>
+          </w:p>
+        </w:tc>
+        <w:tc>
+          <w:tcPr>
+            <w:tcW w:w="1612" w:type="dxa"/>
+            <w:tcMar>
+              <w:top w:w="40" w:type="dxa"/>
+              <w:bottom w:w="40" w:type="dxa"/>
+              <w:left w:w="70" w:type="dxa"/>
+              <w:right w:w="70" w:type="dxa"/>
+            </w:tcMar>
+          </w:tcPr>
+          <w:p>
+            <w:pPr>
+              <w:pStyle w:val="Compact"/>
+              <w:spacing w:line="240" w:lineRule="auto" w:before="0" w:after="0"/>
+              <w:ind w:firstLine="0"/>
+              <w:jc w:val="left"/>
+            </w:pPr>
+            <w:r>
+              <w:rPr>
+                <w:rFonts w:ascii="Arial" w:hAnsi="Arial"/>
+                <w:sz w:val="18"/>
+              </w:rPr>
+              <w:t xml:space="preserve">0,79</w:t>
+            </w:r>
+          </w:p>
+        </w:tc>
+        <w:tc>
+          <w:tcPr>
+            <w:tcW w:w="1794" w:type="dxa"/>
+            <w:tcMar>
+              <w:top w:w="40" w:type="dxa"/>
+              <w:bottom w:w="40" w:type="dxa"/>
+              <w:left w:w="70" w:type="dxa"/>
+              <w:right w:w="70" w:type="dxa"/>
+            </w:tcMar>
+          </w:tcPr>
+          <w:p>
+            <w:pPr>
+              <w:pStyle w:val="Compact"/>
+              <w:spacing w:line="240" w:lineRule="auto" w:before="0" w:after="0"/>
+              <w:ind w:firstLine="0"/>
+              <w:jc w:val="left"/>
+            </w:pPr>
+            <w:r>
+              <w:rPr>
+                <w:rFonts w:ascii="Arial" w:hAnsi="Arial"/>
+                <w:sz w:val="18"/>
+              </w:rPr>
+              <w:t xml:space="preserve">1,71</w:t>
+            </w:r>
+          </w:p>
+        </w:tc>
+      </w:tr>
+      <w:tr>
+        <w:trPr>
+          <w:cantSplit/>
+        </w:trPr>
+        <w:tc>
+          <w:tcPr>
+            <w:tcW w:w="5663" w:type="dxa"/>
+            <w:tcMar>
+              <w:top w:w="40" w:type="dxa"/>
+              <w:bottom w:w="40" w:type="dxa"/>
+              <w:left w:w="70" w:type="dxa"/>
+              <w:right w:w="70" w:type="dxa"/>
+            </w:tcMar>
+          </w:tcPr>
+          <w:p>
+            <w:pPr>
+              <w:pStyle w:val="Compact"/>
+              <w:spacing w:line="240" w:lineRule="auto" w:before="0" w:after="0"/>
+              <w:ind w:firstLine="0"/>
+              <w:jc w:val="left"/>
+            </w:pPr>
+            <w:r>
+              <w:rPr>
+                <w:rFonts w:ascii="Arial" w:hAnsi="Arial"/>
+                <w:sz w:val="18"/>
+              </w:rPr>
+              <w:t xml:space="preserve">E2: ciclo p95 com atraso de 0 ms (ms)</w:t>
+            </w:r>
+          </w:p>
+        </w:tc>
+        <w:tc>
+          <w:tcPr>
+            <w:tcW w:w="1612" w:type="dxa"/>
+            <w:tcMar>
+              <w:top w:w="40" w:type="dxa"/>
+              <w:bottom w:w="40" w:type="dxa"/>
+              <w:left w:w="70" w:type="dxa"/>
+              <w:right w:w="70" w:type="dxa"/>
+            </w:tcMar>
+          </w:tcPr>
+          <w:p>
+            <w:pPr>
+              <w:pStyle w:val="Compact"/>
+              <w:spacing w:line="240" w:lineRule="auto" w:before="0" w:after="0"/>
+              <w:ind w:firstLine="0"/>
+              <w:jc w:val="left"/>
+            </w:pPr>
+            <w:r>
+              <w:rPr>
+                <w:rFonts w:ascii="Arial" w:hAnsi="Arial"/>
+                <w:sz w:val="18"/>
+              </w:rPr>
+              <w:t xml:space="preserve">0,7</w:t>
+            </w:r>
+          </w:p>
+        </w:tc>
+        <w:tc>
+          <w:tcPr>
+            <w:tcW w:w="1794" w:type="dxa"/>
+            <w:tcMar>
+              <w:top w:w="40" w:type="dxa"/>
+              <w:bottom w:w="40" w:type="dxa"/>
+              <w:left w:w="70" w:type="dxa"/>
+              <w:right w:w="70" w:type="dxa"/>
+            </w:tcMar>
+          </w:tcPr>
+          <w:p>
+            <w:pPr>
+              <w:pStyle w:val="Compact"/>
+              <w:spacing w:line="240" w:lineRule="auto" w:before="0" w:after="0"/>
+              <w:ind w:firstLine="0"/>
+              <w:jc w:val="left"/>
+            </w:pPr>
+            <w:r>
+              <w:rPr>
+                <w:rFonts w:ascii="Arial" w:hAnsi="Arial"/>
+                <w:sz w:val="18"/>
+              </w:rPr>
+              <w:t xml:space="preserve">0,8</w:t>
+            </w:r>
+          </w:p>
+        </w:tc>
+      </w:tr>
+      <w:tr>
+        <w:trPr>
+          <w:cantSplit/>
+        </w:trPr>
+        <w:tc>
+          <w:tcPr>
+            <w:tcW w:w="5663" w:type="dxa"/>
+            <w:tcMar>
+              <w:top w:w="40" w:type="dxa"/>
+              <w:bottom w:w="40" w:type="dxa"/>
+              <w:left w:w="70" w:type="dxa"/>
+              <w:right w:w="70" w:type="dxa"/>
+            </w:tcMar>
+          </w:tcPr>
+          <w:p>
+            <w:pPr>
+              <w:pStyle w:val="Compact"/>
+              <w:spacing w:line="240" w:lineRule="auto" w:before="0" w:after="0"/>
+              <w:ind w:firstLine="0"/>
+              <w:jc w:val="left"/>
+            </w:pPr>
+            <w:r>
+              <w:rPr>
+                <w:rFonts w:ascii="Arial" w:hAnsi="Arial"/>
+                <w:sz w:val="18"/>
+              </w:rPr>
+              <w:t xml:space="preserve">E2: ciclo p95 com atraso de 10 ms (ms)</w:t>
+            </w:r>
+          </w:p>
+        </w:tc>
+        <w:tc>
+          <w:tcPr>
+            <w:tcW w:w="1612" w:type="dxa"/>
+            <w:tcMar>
+              <w:top w:w="40" w:type="dxa"/>
+              <w:bottom w:w="40" w:type="dxa"/>
+              <w:left w:w="70" w:type="dxa"/>
+              <w:right w:w="70" w:type="dxa"/>
+            </w:tcMar>
+          </w:tcPr>
+          <w:p>
+            <w:pPr>
+              <w:pStyle w:val="Compact"/>
+              <w:spacing w:line="240" w:lineRule="auto" w:before="0" w:after="0"/>
+              <w:ind w:firstLine="0"/>
+              <w:jc w:val="left"/>
+            </w:pPr>
+            <w:r>
+              <w:rPr>
+                <w:rFonts w:ascii="Arial" w:hAnsi="Arial"/>
+                <w:sz w:val="18"/>
+              </w:rPr>
+              <w:t xml:space="preserve">105,8</w:t>
+            </w:r>
+          </w:p>
+        </w:tc>
+        <w:tc>
+          <w:tcPr>
+            <w:tcW w:w="1794" w:type="dxa"/>
+            <w:tcMar>
+              <w:top w:w="40" w:type="dxa"/>
+              <w:bottom w:w="40" w:type="dxa"/>
+              <w:left w:w="70" w:type="dxa"/>
+              <w:right w:w="70" w:type="dxa"/>
+            </w:tcMar>
+          </w:tcPr>
+          <w:p>
+            <w:pPr>
+              <w:pStyle w:val="Compact"/>
+              <w:spacing w:line="240" w:lineRule="auto" w:before="0" w:after="0"/>
+              <w:ind w:firstLine="0"/>
+              <w:jc w:val="left"/>
+            </w:pPr>
+            <w:r>
+              <w:rPr>
+                <w:rFonts w:ascii="Arial" w:hAnsi="Arial"/>
+                <w:sz w:val="18"/>
+              </w:rPr>
+              <w:t xml:space="preserve">104,0</w:t>
+            </w:r>
+          </w:p>
+        </w:tc>
+      </w:tr>
+      <w:tr>
+        <w:trPr>
+          <w:cantSplit/>
+        </w:trPr>
+        <w:tc>
+          <w:tcPr>
+            <w:tcW w:w="5663" w:type="dxa"/>
+            <w:tcMar>
+              <w:top w:w="40" w:type="dxa"/>
+              <w:bottom w:w="40" w:type="dxa"/>
+              <w:left w:w="70" w:type="dxa"/>
+              <w:right w:w="70" w:type="dxa"/>
+            </w:tcMar>
+          </w:tcPr>
+          <w:p>
+            <w:pPr>
+              <w:pStyle w:val="Compact"/>
+              <w:spacing w:line="240" w:lineRule="auto" w:before="0" w:after="0"/>
+              <w:ind w:firstLine="0"/>
+              <w:jc w:val="left"/>
+            </w:pPr>
+            <w:r>
+              <w:rPr>
+                <w:rFonts w:ascii="Arial" w:hAnsi="Arial"/>
+                <w:sz w:val="18"/>
+              </w:rPr>
+              <w:t xml:space="preserve">E2: ciclo p95 com atraso de 25 ms (ms)</w:t>
+            </w:r>
+          </w:p>
+        </w:tc>
+        <w:tc>
+          <w:tcPr>
+            <w:tcW w:w="1612" w:type="dxa"/>
+            <w:tcMar>
+              <w:top w:w="40" w:type="dxa"/>
+              <w:bottom w:w="40" w:type="dxa"/>
+              <w:left w:w="70" w:type="dxa"/>
+              <w:right w:w="70" w:type="dxa"/>
+            </w:tcMar>
+          </w:tcPr>
+          <w:p>
+            <w:pPr>
+              <w:pStyle w:val="Compact"/>
+              <w:spacing w:line="240" w:lineRule="auto" w:before="0" w:after="0"/>
+              <w:ind w:firstLine="0"/>
+              <w:jc w:val="left"/>
+            </w:pPr>
+            <w:r>
+              <w:rPr>
+                <w:rFonts w:ascii="Arial" w:hAnsi="Arial"/>
+                <w:sz w:val="18"/>
+              </w:rPr>
+              <w:t xml:space="preserve">259,5</w:t>
+            </w:r>
+          </w:p>
+        </w:tc>
+        <w:tc>
+          <w:tcPr>
+            <w:tcW w:w="1794" w:type="dxa"/>
+            <w:tcMar>
+              <w:top w:w="40" w:type="dxa"/>
+              <w:bottom w:w="40" w:type="dxa"/>
+              <w:left w:w="70" w:type="dxa"/>
+              <w:right w:w="70" w:type="dxa"/>
+            </w:tcMar>
+          </w:tcPr>
+          <w:p>
+            <w:pPr>
+              <w:pStyle w:val="Compact"/>
+              <w:spacing w:line="240" w:lineRule="auto" w:before="0" w:after="0"/>
+              <w:ind w:firstLine="0"/>
+              <w:jc w:val="left"/>
+            </w:pPr>
+            <w:r>
+              <w:rPr>
+                <w:rFonts w:ascii="Arial" w:hAnsi="Arial"/>
+                <w:sz w:val="18"/>
+              </w:rPr>
+              <w:t xml:space="preserve">259,3</w:t>
+            </w:r>
+          </w:p>
+        </w:tc>
+      </w:tr>
+      <w:tr>
+        <w:trPr>
+          <w:cantSplit/>
+        </w:trPr>
+        <w:tc>
+          <w:tcPr>
+            <w:tcW w:w="5663" w:type="dxa"/>
+            <w:tcMar>
+              <w:top w:w="40" w:type="dxa"/>
+              <w:bottom w:w="40" w:type="dxa"/>
+              <w:left w:w="70" w:type="dxa"/>
+              <w:right w:w="70" w:type="dxa"/>
+            </w:tcMar>
+          </w:tcPr>
+          <w:p>
+            <w:pPr>
+              <w:pStyle w:val="Compact"/>
+              <w:spacing w:line="240" w:lineRule="auto" w:before="0" w:after="0"/>
+              <w:ind w:firstLine="0"/>
+              <w:jc w:val="left"/>
+            </w:pPr>
+            <w:r>
+              <w:rPr>
+                <w:rFonts w:ascii="Arial" w:hAnsi="Arial"/>
+                <w:sz w:val="18"/>
+              </w:rPr>
+              <w:t xml:space="preserve">E2: ciclo p95 com atraso de 50 ms (ms)</w:t>
+            </w:r>
+          </w:p>
+        </w:tc>
+        <w:tc>
+          <w:tcPr>
+            <w:tcW w:w="1612" w:type="dxa"/>
+            <w:tcMar>
+              <w:top w:w="40" w:type="dxa"/>
+              <w:bottom w:w="40" w:type="dxa"/>
+              <w:left w:w="70" w:type="dxa"/>
+              <w:right w:w="70" w:type="dxa"/>
+            </w:tcMar>
+          </w:tcPr>
+          <w:p>
+            <w:pPr>
+              <w:pStyle w:val="Compact"/>
+              <w:spacing w:line="240" w:lineRule="auto" w:before="0" w:after="0"/>
+              <w:ind w:firstLine="0"/>
+              <w:jc w:val="left"/>
+            </w:pPr>
+            <w:r>
+              <w:rPr>
+                <w:rFonts w:ascii="Arial" w:hAnsi="Arial"/>
+                <w:sz w:val="18"/>
+              </w:rPr>
+              <w:t xml:space="preserve">508,2</w:t>
+            </w:r>
+          </w:p>
+        </w:tc>
+        <w:tc>
+          <w:tcPr>
+            <w:tcW w:w="1794" w:type="dxa"/>
+            <w:tcMar>
+              <w:top w:w="40" w:type="dxa"/>
+              <w:bottom w:w="40" w:type="dxa"/>
+              <w:left w:w="70" w:type="dxa"/>
+              <w:right w:w="70" w:type="dxa"/>
+            </w:tcMar>
+          </w:tcPr>
+          <w:p>
+            <w:pPr>
+              <w:pStyle w:val="Compact"/>
+              <w:spacing w:line="240" w:lineRule="auto" w:before="0" w:after="0"/>
+              <w:ind w:firstLine="0"/>
+              <w:jc w:val="left"/>
+            </w:pPr>
+            <w:r>
+              <w:rPr>
+                <w:rFonts w:ascii="Arial" w:hAnsi="Arial"/>
+                <w:sz w:val="18"/>
+              </w:rPr>
+              <w:t xml:space="preserve">508,6</w:t>
+            </w:r>
+          </w:p>
+        </w:tc>
+      </w:tr>
+      <w:tr>
+        <w:trPr>
+          <w:cantSplit/>
+        </w:trPr>
+        <w:tc>
+          <w:tcPr>
+            <w:tcW w:w="5663" w:type="dxa"/>
+            <w:tcMar>
+              <w:top w:w="40" w:type="dxa"/>
+              <w:bottom w:w="40" w:type="dxa"/>
+              <w:left w:w="70" w:type="dxa"/>
+              <w:right w:w="70" w:type="dxa"/>
+            </w:tcMar>
+          </w:tcPr>
+          <w:p>
+            <w:pPr>
+              <w:pStyle w:val="Compact"/>
+              <w:spacing w:line="240" w:lineRule="auto" w:before="0" w:after="0"/>
+              <w:ind w:firstLine="0"/>
+              <w:jc w:val="left"/>
+            </w:pPr>
+            <w:r>
+              <w:rPr>
+                <w:rFonts w:ascii="Arial" w:hAnsi="Arial"/>
+                <w:sz w:val="18"/>
+              </w:rPr>
+              <w:t xml:space="preserve">E3: ciclo p95 com 1 PID (ms)</w:t>
+            </w:r>
+          </w:p>
+        </w:tc>
+        <w:tc>
+          <w:tcPr>
+            <w:tcW w:w="1612" w:type="dxa"/>
+            <w:tcMar>
+              <w:top w:w="40" w:type="dxa"/>
+              <w:bottom w:w="40" w:type="dxa"/>
+              <w:left w:w="70" w:type="dxa"/>
+              <w:right w:w="70" w:type="dxa"/>
+            </w:tcMar>
+          </w:tcPr>
+          <w:p>
+            <w:pPr>
+              <w:pStyle w:val="Compact"/>
+              <w:spacing w:line="240" w:lineRule="auto" w:before="0" w:after="0"/>
+              <w:ind w:firstLine="0"/>
+              <w:jc w:val="left"/>
+            </w:pPr>
+            <w:r>
+              <w:rPr>
+                <w:rFonts w:ascii="Arial" w:hAnsi="Arial"/>
+                <w:sz w:val="18"/>
+              </w:rPr>
+              <w:t xml:space="preserve">13,6</w:t>
+            </w:r>
+          </w:p>
+        </w:tc>
+        <w:tc>
+          <w:tcPr>
+            <w:tcW w:w="1794" w:type="dxa"/>
+            <w:tcMar>
+              <w:top w:w="40" w:type="dxa"/>
+              <w:bottom w:w="40" w:type="dxa"/>
+              <w:left w:w="70" w:type="dxa"/>
+              <w:right w:w="70" w:type="dxa"/>
+            </w:tcMar>
+          </w:tcPr>
+          <w:p>
+            <w:pPr>
+              <w:pStyle w:val="Compact"/>
+              <w:spacing w:line="240" w:lineRule="auto" w:before="0" w:after="0"/>
+              <w:ind w:firstLine="0"/>
+              <w:jc w:val="left"/>
+            </w:pPr>
+            <w:r>
+              <w:rPr>
+                <w:rFonts w:ascii="Arial" w:hAnsi="Arial"/>
+                <w:sz w:val="18"/>
+              </w:rPr>
+              <w:t xml:space="preserve">13,7</w:t>
+            </w:r>
+          </w:p>
+        </w:tc>
+      </w:tr>
+      <w:tr>
+        <w:trPr>
+          <w:cantSplit/>
+        </w:trPr>
+        <w:tc>
+          <w:tcPr>
+            <w:tcW w:w="5663" w:type="dxa"/>
+            <w:tcMar>
+              <w:top w:w="40" w:type="dxa"/>
+              <w:bottom w:w="40" w:type="dxa"/>
+              <w:left w:w="70" w:type="dxa"/>
+              <w:right w:w="70" w:type="dxa"/>
+            </w:tcMar>
+          </w:tcPr>
+          <w:p>
+            <w:pPr>
+              <w:pStyle w:val="Compact"/>
+              <w:spacing w:line="240" w:lineRule="auto" w:before="0" w:after="0"/>
+              <w:ind w:firstLine="0"/>
+              <w:jc w:val="left"/>
+            </w:pPr>
+            <w:r>
+              <w:rPr>
+                <w:rFonts w:ascii="Arial" w:hAnsi="Arial"/>
+                <w:sz w:val="18"/>
+              </w:rPr>
+              <w:t xml:space="preserve">E3: ciclo p95 com 3 PIDs (ms)</w:t>
+            </w:r>
+          </w:p>
+        </w:tc>
+        <w:tc>
+          <w:tcPr>
+            <w:tcW w:w="1612" w:type="dxa"/>
+            <w:tcMar>
+              <w:top w:w="40" w:type="dxa"/>
+              <w:bottom w:w="40" w:type="dxa"/>
+              <w:left w:w="70" w:type="dxa"/>
+              <w:right w:w="70" w:type="dxa"/>
+            </w:tcMar>
+          </w:tcPr>
+          <w:p>
+            <w:pPr>
+              <w:pStyle w:val="Compact"/>
+              <w:spacing w:line="240" w:lineRule="auto" w:before="0" w:after="0"/>
+              <w:ind w:firstLine="0"/>
+              <w:jc w:val="left"/>
+            </w:pPr>
+            <w:r>
+              <w:rPr>
+                <w:rFonts w:ascii="Arial" w:hAnsi="Arial"/>
+                <w:sz w:val="18"/>
+              </w:rPr>
+              <w:t xml:space="preserve">37,3</w:t>
+            </w:r>
+          </w:p>
+        </w:tc>
+        <w:tc>
+          <w:tcPr>
+            <w:tcW w:w="1794" w:type="dxa"/>
+            <w:tcMar>
+              <w:top w:w="40" w:type="dxa"/>
+              <w:bottom w:w="40" w:type="dxa"/>
+              <w:left w:w="70" w:type="dxa"/>
+              <w:right w:w="70" w:type="dxa"/>
+            </w:tcMar>
+          </w:tcPr>
+          <w:p>
+            <w:pPr>
+              <w:pStyle w:val="Compact"/>
+              <w:spacing w:line="240" w:lineRule="auto" w:before="0" w:after="0"/>
+              <w:ind w:firstLine="0"/>
+              <w:jc w:val="left"/>
+            </w:pPr>
+            <w:r>
+              <w:rPr>
+                <w:rFonts w:ascii="Arial" w:hAnsi="Arial"/>
+                <w:sz w:val="18"/>
+              </w:rPr>
+              <w:t xml:space="preserve">37,3</w:t>
+            </w:r>
+          </w:p>
+        </w:tc>
+      </w:tr>
+      <w:tr>
+        <w:trPr>
+          <w:cantSplit/>
+        </w:trPr>
+        <w:tc>
+          <w:tcPr>
+            <w:tcW w:w="5663" w:type="dxa"/>
+            <w:tcMar>
+              <w:top w:w="40" w:type="dxa"/>
+              <w:bottom w:w="40" w:type="dxa"/>
+              <w:left w:w="70" w:type="dxa"/>
+              <w:right w:w="70" w:type="dxa"/>
+            </w:tcMar>
+          </w:tcPr>
+          <w:p>
+            <w:pPr>
+              <w:pStyle w:val="Compact"/>
+              <w:spacing w:line="240" w:lineRule="auto" w:before="0" w:after="0"/>
+              <w:ind w:firstLine="0"/>
+              <w:jc w:val="left"/>
+            </w:pPr>
+            <w:r>
+              <w:rPr>
+                <w:rFonts w:ascii="Arial" w:hAnsi="Arial"/>
+                <w:sz w:val="18"/>
+              </w:rPr>
+              <w:t xml:space="preserve">E3: ciclo p95 com 5 PIDs (ms)</w:t>
+            </w:r>
+          </w:p>
+        </w:tc>
+        <w:tc>
+          <w:tcPr>
+            <w:tcW w:w="1612" w:type="dxa"/>
+            <w:tcMar>
+              <w:top w:w="40" w:type="dxa"/>
+              <w:bottom w:w="40" w:type="dxa"/>
+              <w:left w:w="70" w:type="dxa"/>
+              <w:right w:w="70" w:type="dxa"/>
+            </w:tcMar>
+          </w:tcPr>
+          <w:p>
+            <w:pPr>
+              <w:pStyle w:val="Compact"/>
+              <w:spacing w:line="240" w:lineRule="auto" w:before="0" w:after="0"/>
+              <w:ind w:firstLine="0"/>
+              <w:jc w:val="left"/>
+            </w:pPr>
+            <w:r>
+              <w:rPr>
+                <w:rFonts w:ascii="Arial" w:hAnsi="Arial"/>
+                <w:sz w:val="18"/>
+              </w:rPr>
+              <w:t xml:space="preserve">59,7</w:t>
+            </w:r>
+          </w:p>
+        </w:tc>
+        <w:tc>
+          <w:tcPr>
+            <w:tcW w:w="1794" w:type="dxa"/>
+            <w:tcMar>
+              <w:top w:w="40" w:type="dxa"/>
+              <w:bottom w:w="40" w:type="dxa"/>
+              <w:left w:w="70" w:type="dxa"/>
+              <w:right w:w="70" w:type="dxa"/>
+            </w:tcMar>
+          </w:tcPr>
+          <w:p>
+            <w:pPr>
+              <w:pStyle w:val="Compact"/>
+              <w:spacing w:line="240" w:lineRule="auto" w:before="0" w:after="0"/>
+              <w:ind w:firstLine="0"/>
+              <w:jc w:val="left"/>
+            </w:pPr>
+            <w:r>
+              <w:rPr>
+                <w:rFonts w:ascii="Arial" w:hAnsi="Arial"/>
+                <w:sz w:val="18"/>
+              </w:rPr>
+              <w:t xml:space="preserve">59,8</w:t>
+            </w:r>
+          </w:p>
+        </w:tc>
+      </w:tr>
+      <w:tr>
+        <w:trPr>
+          <w:cantSplit/>
+        </w:trPr>
+        <w:tc>
+          <w:tcPr>
+            <w:tcW w:w="5663" w:type="dxa"/>
+            <w:tcMar>
+              <w:top w:w="40" w:type="dxa"/>
+              <w:bottom w:w="40" w:type="dxa"/>
+              <w:left w:w="70" w:type="dxa"/>
+              <w:right w:w="70" w:type="dxa"/>
+            </w:tcMar>
+          </w:tcPr>
+          <w:p>
+            <w:pPr>
+              <w:pStyle w:val="Compact"/>
+              <w:spacing w:line="240" w:lineRule="auto" w:before="0" w:after="0"/>
+              <w:ind w:firstLine="0"/>
+              <w:jc w:val="left"/>
+            </w:pPr>
+            <w:r>
+              <w:rPr>
+                <w:rFonts w:ascii="Arial" w:hAnsi="Arial"/>
+                <w:sz w:val="18"/>
+              </w:rPr>
+              <w:t xml:space="preserve">E3: ciclo p95 com 10 PIDs (ms)</w:t>
+            </w:r>
+          </w:p>
+        </w:tc>
+        <w:tc>
+          <w:tcPr>
+            <w:tcW w:w="1612" w:type="dxa"/>
+            <w:tcMar>
+              <w:top w:w="40" w:type="dxa"/>
+              <w:bottom w:w="40" w:type="dxa"/>
+              <w:left w:w="70" w:type="dxa"/>
+              <w:right w:w="70" w:type="dxa"/>
+            </w:tcMar>
+          </w:tcPr>
+          <w:p>
+            <w:pPr>
+              <w:pStyle w:val="Compact"/>
+              <w:spacing w:line="240" w:lineRule="auto" w:before="0" w:after="0"/>
+              <w:ind w:firstLine="0"/>
+              <w:jc w:val="left"/>
+            </w:pPr>
+            <w:r>
+              <w:rPr>
+                <w:rFonts w:ascii="Arial" w:hAnsi="Arial"/>
+                <w:sz w:val="18"/>
+              </w:rPr>
+              <w:t xml:space="preserve">116,9</w:t>
+            </w:r>
+          </w:p>
+        </w:tc>
+        <w:tc>
+          <w:tcPr>
+            <w:tcW w:w="1794" w:type="dxa"/>
+            <w:tcMar>
+              <w:top w:w="40" w:type="dxa"/>
+              <w:bottom w:w="40" w:type="dxa"/>
+              <w:left w:w="70" w:type="dxa"/>
+              <w:right w:w="70" w:type="dxa"/>
+            </w:tcMar>
+          </w:tcPr>
+          <w:p>
+            <w:pPr>
+              <w:pStyle w:val="Compact"/>
+              <w:spacing w:line="240" w:lineRule="auto" w:before="0" w:after="0"/>
+              <w:ind w:firstLine="0"/>
+              <w:jc w:val="left"/>
+            </w:pPr>
+            <w:r>
+              <w:rPr>
+                <w:rFonts w:ascii="Arial" w:hAnsi="Arial"/>
+                <w:sz w:val="18"/>
+              </w:rPr>
+              <w:t xml:space="preserve">116,7</w:t>
+            </w:r>
+          </w:p>
+        </w:tc>
+      </w:tr>
+      <w:tr>
+        <w:trPr>
+          <w:cantSplit/>
+        </w:trPr>
+        <w:tc>
+          <w:tcPr>
+            <w:tcW w:w="5663" w:type="dxa"/>
+            <w:tcMar>
+              <w:top w:w="40" w:type="dxa"/>
+              <w:bottom w:w="40" w:type="dxa"/>
+              <w:left w:w="70" w:type="dxa"/>
+              <w:right w:w="70" w:type="dxa"/>
+            </w:tcMar>
+          </w:tcPr>
+          <w:p>
+            <w:pPr>
+              <w:pStyle w:val="Compact"/>
+              <w:spacing w:line="240" w:lineRule="auto" w:before="0" w:after="0"/>
+              <w:ind w:firstLine="0"/>
+              <w:jc w:val="left"/>
+            </w:pPr>
+            <w:r>
+              <w:rPr>
+                <w:rFonts w:ascii="Arial" w:hAnsi="Arial"/>
+                <w:sz w:val="18"/>
+              </w:rPr>
+              <w:t xml:space="preserve">Perdas, duplicações, timeouts e leituras com erro acima de r/2 (todos os casos)</w:t>
+            </w:r>
+          </w:p>
+        </w:tc>
+        <w:tc>
+          <w:tcPr>
+            <w:tcW w:w="1612" w:type="dxa"/>
+            <w:tcMar>
+              <w:top w:w="40" w:type="dxa"/>
+              <w:bottom w:w="40" w:type="dxa"/>
+              <w:left w:w="70" w:type="dxa"/>
+              <w:right w:w="70" w:type="dxa"/>
+            </w:tcMar>
+          </w:tcPr>
+          <w:p>
+            <w:pPr>
+              <w:pStyle w:val="Compact"/>
+              <w:spacing w:line="240" w:lineRule="auto" w:before="0" w:after="0"/>
+              <w:ind w:firstLine="0"/>
+              <w:jc w:val="left"/>
+            </w:pPr>
+            <w:r>
+              <w:rPr>
+                <w:rFonts w:ascii="Arial" w:hAnsi="Arial"/>
+                <w:sz w:val="18"/>
+              </w:rPr>
+              <w:t xml:space="preserve">0</w:t>
+            </w:r>
+          </w:p>
+        </w:tc>
+        <w:tc>
+          <w:tcPr>
+            <w:tcW w:w="1794" w:type="dxa"/>
+            <w:tcMar>
+              <w:top w:w="40" w:type="dxa"/>
+              <w:bottom w:w="40" w:type="dxa"/>
+              <w:left w:w="70" w:type="dxa"/>
+              <w:right w:w="70" w:type="dxa"/>
+            </w:tcMar>
+          </w:tcPr>
+          <w:p>
+            <w:pPr>
+              <w:pStyle w:val="Compact"/>
+              <w:spacing w:line="240" w:lineRule="auto" w:before="0" w:after="0"/>
+              <w:ind w:firstLine="0"/>
+              <w:jc w:val="left"/>
+            </w:pPr>
+            <w:r>
+              <w:rPr>
+                <w:rFonts w:ascii="Arial" w:hAnsi="Arial"/>
+                <w:sz w:val="18"/>
+              </w:rPr>
+              <w:t xml:space="preserve">0</w:t>
+            </w:r>
+          </w:p>
+        </w:tc>
+      </w:tr>
+    </w:tbl>
+    <w:p>
+      <w:pPr>
+        <w:pStyle w:val="Fonte"/>
+      </w:pPr>
+      <w:r>
+        <w:t xml:space="preserve">Fonte: tabelas anteriores deste capítulo e saída de terminal da repetição, feita pelos autores em 24/10/2026 (comando do Apêndice B; arquivos em</w:t>
+      </w:r>
+      <w:r>
+        <w:t xml:space="preserve"> </w:t>
+      </w:r>
+      <w:r>
+        <w:rPr>
+          <w:rStyle w:val="VerbatimChar"/>
+        </w:rPr>
+        <w:t xml:space="preserve">runs/repeticao/</w:t>
+      </w:r>
+      <w:r>
+        <w:t xml:space="preserve">, não versionados).</w:t>
+      </w:r>
+    </w:p>
+    <w:p>
+      <w:pPr>
+        <w:pStyle w:val="BodyText"/>
+      </w:pPr>
+      <w:r>
+        <w:t xml:space="preserve">Os tempos de ciclo, RTT e latência ficaram muito próximos (diferenças de até 0,3 ms na latência e de até 1,8 ms no ciclo de 10 ms de atraso), e todos os requisitos continuaram atendidos, com erro de decodificação, perdas, duplicações e</w:t>
+      </w:r>
+      <w:r>
+        <w:t xml:space="preserve"> </w:t>
+      </w:r>
+      <w:r>
+        <w:rPr>
+          <w:iCs/>
+          <w:i/>
+        </w:rPr>
+        <w:t xml:space="preserve">timeouts</w:t>
+      </w:r>
+      <w:r>
+        <w:t xml:space="preserve"> </w:t>
+      </w:r>
+      <w:r>
+        <w:t xml:space="preserve">iguais a zero. A única medida que mudou de modo visível foi o tempo de detecção da P0300, de 0,79 s para 1,71 s. Isso é esperado: o instante em que a falha é agendada é o mesmo, mas o relógio de parede e a fase do período de 2 s da consulta ao PID</w:t>
+      </w:r>
+      <w:r>
+        <w:t xml:space="preserve"> </w:t>
+      </w:r>
+      <w:r>
+        <w:rPr>
+          <w:rStyle w:val="VerbatimChar"/>
+        </w:rPr>
+        <w:t xml:space="preserve">0x01</w:t>
+      </w:r>
+      <w:r>
+        <w:t xml:space="preserve"> </w:t>
+      </w:r>
+      <w:r>
+        <w:t xml:space="preserve">variam de uma execução para outra, e o atraso de detecção cai em qualquer ponto entre perto de zero e 2 s. Ambos os valores estão dentro desse intervalo. A repetição não é independente (ver a Seção 4.10), e uma segunda máquina, prevista no requisito RNF05, continua pendente (Apêndice B). Cada ensaio, nas duas execuções, é uma única amostra de tempo, de modo que não foi calculada uma variação estatística entre execuções.</w:t>
       </w:r>
     </w:p>
     <w:p>
@@ -36019,7 +37297,7 @@
         <w:pStyle w:val="FirstParagraph"/>
       </w:pPr>
       <w:r>
-        <w:t xml:space="preserve">A Tabela 26 resume a situação de cada requisito e a evidência.</w:t>
+        <w:t xml:space="preserve">A Tabela 27 resume a situação de cada requisito e a evidência.</w:t>
       </w:r>
     </w:p>
     <w:p>
@@ -36027,7 +37305,7 @@
         <w:pStyle w:val="LegendaTabela"/>
       </w:pPr>
       <w:r>
-        <w:t xml:space="preserve">Tabela 26: Atendimento aos requisitos</w:t>
+        <w:t xml:space="preserve">Tabela 27: Atendimento aos requisitos</w:t>
       </w:r>
     </w:p>
     <w:tbl>
@@ -37938,7 +39216,7 @@
         <w:t xml:space="preserve"> </w:t>
       </w:r>
       <w:r>
-        <w:t xml:space="preserve">Os tempos vêm de uma única execução de cada ensaio em um computador, sem repetições independentes. Os desvios padrão são internos a cada execução, e a variação entre execuções e entre máquinas não foi estimada.</w:t>
+        <w:t xml:space="preserve">Os tempos vêm de um computador. Os ensaios E1 a E3 foram repetidos uma vez em contêiner isolado, na mesma máquina, com resultados muito próximos, mas essa repetição não é independente e não permite estimar a variação estatística; a variação entre máquinas não foi estimada.</w:t>
       </w:r>
     </w:p>
     <w:p>
@@ -38801,7 +40079,7 @@
         <w:pStyle w:val="FirstParagraph"/>
       </w:pPr>
       <w:r>
-        <w:t xml:space="preserve">Cada número reportado neste trabalho tem uma fonte rastreável no repositório. A Tabela 27 relaciona os números principais, o arquivo de origem e a forma de obtê-los. Números não listados aqui são derivações aritméticas simples dos listados (por exemplo, percentuais e razões), ou vêm de tabelas copiadas diretamente do arquivo citado na legenda.</w:t>
+        <w:t xml:space="preserve">Cada número reportado neste trabalho tem uma fonte rastreável no repositório. A Tabela 28 relaciona os números principais, o arquivo de origem e a forma de obtê-los. Números não listados aqui são derivações aritméticas simples dos listados (por exemplo, percentuais e razões), ou vêm de tabelas copiadas diretamente do arquivo citado na legenda.</w:t>
       </w:r>
     </w:p>
     <w:p>
@@ -38809,7 +40087,7 @@
         <w:pStyle w:val="LegendaTabela"/>
       </w:pPr>
       <w:r>
-        <w:t xml:space="preserve">Tabela 27: Origem dos números do Capítulo 5</w:t>
+        <w:t xml:space="preserve">Tabela 28: Origem dos números do Capítulo 5</w:t>
       </w:r>
     </w:p>
     <w:tbl>
@@ -38830,10 +40108,10 @@
         </w:tblBorders>
       </w:tblPr>
       <w:tblGrid>
-        <w:gridCol w:w="2006"/>
-        <w:gridCol w:w="2063"/>
-        <w:gridCol w:w="2532"/>
-        <w:gridCol w:w="2468"/>
+        <w:gridCol w:w="2019"/>
+        <w:gridCol w:w="2048"/>
+        <w:gridCol w:w="2527"/>
+        <w:gridCol w:w="2475"/>
       </w:tblGrid>
       <w:tr>
         <w:trPr>
@@ -38843,7 +40121,7 @@
         </w:trPr>
         <w:tc>
           <w:tcPr>
-            <w:tcW w:w="2006" w:type="dxa"/>
+            <w:tcW w:w="2019" w:type="dxa"/>
             <w:shd w:val="clear" w:fill="E7E6E6"/>
             <w:tcMar>
               <w:top w:w="40" w:type="dxa"/>
@@ -38871,7 +40149,7 @@
         </w:tc>
         <w:tc>
           <w:tcPr>
-            <w:tcW w:w="2063" w:type="dxa"/>
+            <w:tcW w:w="2048" w:type="dxa"/>
             <w:shd w:val="clear" w:fill="E7E6E6"/>
             <w:tcMar>
               <w:top w:w="40" w:type="dxa"/>
@@ -38899,7 +40177,7 @@
         </w:tc>
         <w:tc>
           <w:tcPr>
-            <w:tcW w:w="2532" w:type="dxa"/>
+            <w:tcW w:w="2527" w:type="dxa"/>
             <w:shd w:val="clear" w:fill="E7E6E6"/>
             <w:tcMar>
               <w:top w:w="40" w:type="dxa"/>
@@ -38927,7 +40205,7 @@
         </w:tc>
         <w:tc>
           <w:tcPr>
-            <w:tcW w:w="2468" w:type="dxa"/>
+            <w:tcW w:w="2475" w:type="dxa"/>
             <w:shd w:val="clear" w:fill="E7E6E6"/>
             <w:tcMar>
               <w:top w:w="40" w:type="dxa"/>
@@ -38960,7 +40238,7 @@
         </w:trPr>
         <w:tc>
           <w:tcPr>
-            <w:tcW w:w="2006" w:type="dxa"/>
+            <w:tcW w:w="2019" w:type="dxa"/>
             <w:tcMar>
               <w:top w:w="40" w:type="dxa"/>
               <w:bottom w:w="40" w:type="dxa"/>
@@ -38986,7 +40264,7 @@
         </w:tc>
         <w:tc>
           <w:tcPr>
-            <w:tcW w:w="2063" w:type="dxa"/>
+            <w:tcW w:w="2048" w:type="dxa"/>
             <w:tcMar>
               <w:top w:w="40" w:type="dxa"/>
               <w:bottom w:w="40" w:type="dxa"/>
@@ -39012,7 +40290,7 @@
         </w:tc>
         <w:tc>
           <w:tcPr>
-            <w:tcW w:w="2532" w:type="dxa"/>
+            <w:tcW w:w="2527" w:type="dxa"/>
             <w:tcMar>
               <w:top w:w="40" w:type="dxa"/>
               <w:bottom w:w="40" w:type="dxa"/>
@@ -39053,7 +40331,7 @@
         </w:tc>
         <w:tc>
           <w:tcPr>
-            <w:tcW w:w="2468" w:type="dxa"/>
+            <w:tcW w:w="2475" w:type="dxa"/>
             <w:tcMar>
               <w:top w:w="40" w:type="dxa"/>
               <w:bottom w:w="40" w:type="dxa"/>
@@ -39099,7 +40377,7 @@
         </w:trPr>
         <w:tc>
           <w:tcPr>
-            <w:tcW w:w="2006" w:type="dxa"/>
+            <w:tcW w:w="2019" w:type="dxa"/>
             <w:tcMar>
               <w:top w:w="40" w:type="dxa"/>
               <w:bottom w:w="40" w:type="dxa"/>
@@ -39125,7 +40403,7 @@
         </w:tc>
         <w:tc>
           <w:tcPr>
-            <w:tcW w:w="2063" w:type="dxa"/>
+            <w:tcW w:w="2048" w:type="dxa"/>
             <w:tcMar>
               <w:top w:w="40" w:type="dxa"/>
               <w:bottom w:w="40" w:type="dxa"/>
@@ -39151,7 +40429,7 @@
         </w:tc>
         <w:tc>
           <w:tcPr>
-            <w:tcW w:w="2532" w:type="dxa"/>
+            <w:tcW w:w="2527" w:type="dxa"/>
             <w:tcMar>
               <w:top w:w="40" w:type="dxa"/>
               <w:bottom w:w="40" w:type="dxa"/>
@@ -39192,7 +40470,7 @@
         </w:tc>
         <w:tc>
           <w:tcPr>
-            <w:tcW w:w="2468" w:type="dxa"/>
+            <w:tcW w:w="2475" w:type="dxa"/>
             <w:tcMar>
               <w:top w:w="40" w:type="dxa"/>
               <w:bottom w:w="40" w:type="dxa"/>
@@ -39223,7 +40501,7 @@
         </w:trPr>
         <w:tc>
           <w:tcPr>
-            <w:tcW w:w="2006" w:type="dxa"/>
+            <w:tcW w:w="2019" w:type="dxa"/>
             <w:tcMar>
               <w:top w:w="40" w:type="dxa"/>
               <w:bottom w:w="40" w:type="dxa"/>
@@ -39249,7 +40527,7 @@
         </w:tc>
         <w:tc>
           <w:tcPr>
-            <w:tcW w:w="2063" w:type="dxa"/>
+            <w:tcW w:w="2048" w:type="dxa"/>
             <w:tcMar>
               <w:top w:w="40" w:type="dxa"/>
               <w:bottom w:w="40" w:type="dxa"/>
@@ -39275,7 +40553,7 @@
         </w:tc>
         <w:tc>
           <w:tcPr>
-            <w:tcW w:w="2532" w:type="dxa"/>
+            <w:tcW w:w="2527" w:type="dxa"/>
             <w:tcMar>
               <w:top w:w="40" w:type="dxa"/>
               <w:bottom w:w="40" w:type="dxa"/>
@@ -39316,7 +40594,7 @@
         </w:tc>
         <w:tc>
           <w:tcPr>
-            <w:tcW w:w="2468" w:type="dxa"/>
+            <w:tcW w:w="2475" w:type="dxa"/>
             <w:tcMar>
               <w:top w:w="40" w:type="dxa"/>
               <w:bottom w:w="40" w:type="dxa"/>
@@ -39347,7 +40625,7 @@
         </w:trPr>
         <w:tc>
           <w:tcPr>
-            <w:tcW w:w="2006" w:type="dxa"/>
+            <w:tcW w:w="2019" w:type="dxa"/>
             <w:tcMar>
               <w:top w:w="40" w:type="dxa"/>
               <w:bottom w:w="40" w:type="dxa"/>
@@ -39373,7 +40651,7 @@
         </w:tc>
         <w:tc>
           <w:tcPr>
-            <w:tcW w:w="2063" w:type="dxa"/>
+            <w:tcW w:w="2048" w:type="dxa"/>
             <w:tcMar>
               <w:top w:w="40" w:type="dxa"/>
               <w:bottom w:w="40" w:type="dxa"/>
@@ -39399,7 +40677,7 @@
         </w:tc>
         <w:tc>
           <w:tcPr>
-            <w:tcW w:w="2532" w:type="dxa"/>
+            <w:tcW w:w="2527" w:type="dxa"/>
             <w:tcMar>
               <w:top w:w="40" w:type="dxa"/>
               <w:bottom w:w="40" w:type="dxa"/>
@@ -39426,7 +40704,7 @@
         </w:tc>
         <w:tc>
           <w:tcPr>
-            <w:tcW w:w="2468" w:type="dxa"/>
+            <w:tcW w:w="2475" w:type="dxa"/>
             <w:tcMar>
               <w:top w:w="40" w:type="dxa"/>
               <w:bottom w:w="40" w:type="dxa"/>
@@ -39501,7 +40779,7 @@
         </w:trPr>
         <w:tc>
           <w:tcPr>
-            <w:tcW w:w="2006" w:type="dxa"/>
+            <w:tcW w:w="2019" w:type="dxa"/>
             <w:tcMar>
               <w:top w:w="40" w:type="dxa"/>
               <w:bottom w:w="40" w:type="dxa"/>
@@ -39527,7 +40805,7 @@
         </w:tc>
         <w:tc>
           <w:tcPr>
-            <w:tcW w:w="2063" w:type="dxa"/>
+            <w:tcW w:w="2048" w:type="dxa"/>
             <w:tcMar>
               <w:top w:w="40" w:type="dxa"/>
               <w:bottom w:w="40" w:type="dxa"/>
@@ -39553,7 +40831,7 @@
         </w:tc>
         <w:tc>
           <w:tcPr>
-            <w:tcW w:w="2532" w:type="dxa"/>
+            <w:tcW w:w="2527" w:type="dxa"/>
             <w:tcMar>
               <w:top w:w="40" w:type="dxa"/>
               <w:bottom w:w="40" w:type="dxa"/>
@@ -39580,7 +40858,7 @@
         </w:tc>
         <w:tc>
           <w:tcPr>
-            <w:tcW w:w="2468" w:type="dxa"/>
+            <w:tcW w:w="2475" w:type="dxa"/>
             <w:tcMar>
               <w:top w:w="40" w:type="dxa"/>
               <w:bottom w:w="40" w:type="dxa"/>
@@ -39626,7 +40904,7 @@
         </w:trPr>
         <w:tc>
           <w:tcPr>
-            <w:tcW w:w="2006" w:type="dxa"/>
+            <w:tcW w:w="2019" w:type="dxa"/>
             <w:tcMar>
               <w:top w:w="40" w:type="dxa"/>
               <w:bottom w:w="40" w:type="dxa"/>
@@ -39652,7 +40930,7 @@
         </w:tc>
         <w:tc>
           <w:tcPr>
-            <w:tcW w:w="2063" w:type="dxa"/>
+            <w:tcW w:w="2048" w:type="dxa"/>
             <w:tcMar>
               <w:top w:w="40" w:type="dxa"/>
               <w:bottom w:w="40" w:type="dxa"/>
@@ -39678,7 +40956,7 @@
         </w:tc>
         <w:tc>
           <w:tcPr>
-            <w:tcW w:w="2532" w:type="dxa"/>
+            <w:tcW w:w="2527" w:type="dxa"/>
             <w:tcMar>
               <w:top w:w="40" w:type="dxa"/>
               <w:bottom w:w="40" w:type="dxa"/>
@@ -39705,7 +40983,7 @@
         </w:tc>
         <w:tc>
           <w:tcPr>
-            <w:tcW w:w="2468" w:type="dxa"/>
+            <w:tcW w:w="2475" w:type="dxa"/>
             <w:tcMar>
               <w:top w:w="40" w:type="dxa"/>
               <w:bottom w:w="40" w:type="dxa"/>
@@ -39751,7 +41029,7 @@
         </w:trPr>
         <w:tc>
           <w:tcPr>
-            <w:tcW w:w="2006" w:type="dxa"/>
+            <w:tcW w:w="2019" w:type="dxa"/>
             <w:tcMar>
               <w:top w:w="40" w:type="dxa"/>
               <w:bottom w:w="40" w:type="dxa"/>
@@ -39777,7 +41055,7 @@
         </w:tc>
         <w:tc>
           <w:tcPr>
-            <w:tcW w:w="2063" w:type="dxa"/>
+            <w:tcW w:w="2048" w:type="dxa"/>
             <w:tcMar>
               <w:top w:w="40" w:type="dxa"/>
               <w:bottom w:w="40" w:type="dxa"/>
@@ -39803,7 +41081,7 @@
         </w:tc>
         <w:tc>
           <w:tcPr>
-            <w:tcW w:w="2532" w:type="dxa"/>
+            <w:tcW w:w="2527" w:type="dxa"/>
             <w:tcMar>
               <w:top w:w="40" w:type="dxa"/>
               <w:bottom w:w="40" w:type="dxa"/>
@@ -39830,7 +41108,7 @@
         </w:tc>
         <w:tc>
           <w:tcPr>
-            <w:tcW w:w="2468" w:type="dxa"/>
+            <w:tcW w:w="2475" w:type="dxa"/>
             <w:tcMar>
               <w:top w:w="40" w:type="dxa"/>
               <w:bottom w:w="40" w:type="dxa"/>
@@ -39876,7 +41154,7 @@
         </w:trPr>
         <w:tc>
           <w:tcPr>
-            <w:tcW w:w="2006" w:type="dxa"/>
+            <w:tcW w:w="2019" w:type="dxa"/>
             <w:tcMar>
               <w:top w:w="40" w:type="dxa"/>
               <w:bottom w:w="40" w:type="dxa"/>
@@ -39902,7 +41180,7 @@
         </w:tc>
         <w:tc>
           <w:tcPr>
-            <w:tcW w:w="2063" w:type="dxa"/>
+            <w:tcW w:w="2048" w:type="dxa"/>
             <w:tcMar>
               <w:top w:w="40" w:type="dxa"/>
               <w:bottom w:w="40" w:type="dxa"/>
@@ -39928,7 +41206,7 @@
         </w:tc>
         <w:tc>
           <w:tcPr>
-            <w:tcW w:w="2532" w:type="dxa"/>
+            <w:tcW w:w="2527" w:type="dxa"/>
             <w:tcMar>
               <w:top w:w="40" w:type="dxa"/>
               <w:bottom w:w="40" w:type="dxa"/>
@@ -39955,7 +41233,7 @@
         </w:tc>
         <w:tc>
           <w:tcPr>
-            <w:tcW w:w="2468" w:type="dxa"/>
+            <w:tcW w:w="2475" w:type="dxa"/>
             <w:tcMar>
               <w:top w:w="40" w:type="dxa"/>
               <w:bottom w:w="40" w:type="dxa"/>
@@ -40023,7 +41301,7 @@
         </w:trPr>
         <w:tc>
           <w:tcPr>
-            <w:tcW w:w="2006" w:type="dxa"/>
+            <w:tcW w:w="2019" w:type="dxa"/>
             <w:tcMar>
               <w:top w:w="40" w:type="dxa"/>
               <w:bottom w:w="40" w:type="dxa"/>
@@ -40049,7 +41327,7 @@
         </w:tc>
         <w:tc>
           <w:tcPr>
-            <w:tcW w:w="2063" w:type="dxa"/>
+            <w:tcW w:w="2048" w:type="dxa"/>
             <w:tcMar>
               <w:top w:w="40" w:type="dxa"/>
               <w:bottom w:w="40" w:type="dxa"/>
@@ -40075,7 +41353,7 @@
         </w:tc>
         <w:tc>
           <w:tcPr>
-            <w:tcW w:w="2532" w:type="dxa"/>
+            <w:tcW w:w="2527" w:type="dxa"/>
             <w:tcMar>
               <w:top w:w="40" w:type="dxa"/>
               <w:bottom w:w="40" w:type="dxa"/>
@@ -40102,7 +41380,7 @@
         </w:tc>
         <w:tc>
           <w:tcPr>
-            <w:tcW w:w="2468" w:type="dxa"/>
+            <w:tcW w:w="2475" w:type="dxa"/>
             <w:tcMar>
               <w:top w:w="40" w:type="dxa"/>
               <w:bottom w:w="40" w:type="dxa"/>
@@ -40148,7 +41426,7 @@
         </w:trPr>
         <w:tc>
           <w:tcPr>
-            <w:tcW w:w="2006" w:type="dxa"/>
+            <w:tcW w:w="2019" w:type="dxa"/>
             <w:tcMar>
               <w:top w:w="40" w:type="dxa"/>
               <w:bottom w:w="40" w:type="dxa"/>
@@ -40174,7 +41452,7 @@
         </w:tc>
         <w:tc>
           <w:tcPr>
-            <w:tcW w:w="2063" w:type="dxa"/>
+            <w:tcW w:w="2048" w:type="dxa"/>
             <w:tcMar>
               <w:top w:w="40" w:type="dxa"/>
               <w:bottom w:w="40" w:type="dxa"/>
@@ -40200,7 +41478,7 @@
         </w:tc>
         <w:tc>
           <w:tcPr>
-            <w:tcW w:w="2532" w:type="dxa"/>
+            <w:tcW w:w="2527" w:type="dxa"/>
             <w:tcMar>
               <w:top w:w="40" w:type="dxa"/>
               <w:bottom w:w="40" w:type="dxa"/>
@@ -40227,7 +41505,7 @@
         </w:tc>
         <w:tc>
           <w:tcPr>
-            <w:tcW w:w="2468" w:type="dxa"/>
+            <w:tcW w:w="2475" w:type="dxa"/>
             <w:tcMar>
               <w:top w:w="40" w:type="dxa"/>
               <w:bottom w:w="40" w:type="dxa"/>
@@ -40316,7 +41594,7 @@
         </w:trPr>
         <w:tc>
           <w:tcPr>
-            <w:tcW w:w="2006" w:type="dxa"/>
+            <w:tcW w:w="2019" w:type="dxa"/>
             <w:tcMar>
               <w:top w:w="40" w:type="dxa"/>
               <w:bottom w:w="40" w:type="dxa"/>
@@ -40342,7 +41620,7 @@
         </w:tc>
         <w:tc>
           <w:tcPr>
-            <w:tcW w:w="2063" w:type="dxa"/>
+            <w:tcW w:w="2048" w:type="dxa"/>
             <w:tcMar>
               <w:top w:w="40" w:type="dxa"/>
               <w:bottom w:w="40" w:type="dxa"/>
@@ -40368,7 +41646,7 @@
         </w:tc>
         <w:tc>
           <w:tcPr>
-            <w:tcW w:w="2532" w:type="dxa"/>
+            <w:tcW w:w="2527" w:type="dxa"/>
             <w:tcMar>
               <w:top w:w="40" w:type="dxa"/>
               <w:bottom w:w="40" w:type="dxa"/>
@@ -40395,7 +41673,7 @@
         </w:tc>
         <w:tc>
           <w:tcPr>
-            <w:tcW w:w="2468" w:type="dxa"/>
+            <w:tcW w:w="2475" w:type="dxa"/>
             <w:tcMar>
               <w:top w:w="40" w:type="dxa"/>
               <w:bottom w:w="40" w:type="dxa"/>
@@ -40426,7 +41704,7 @@
         </w:trPr>
         <w:tc>
           <w:tcPr>
-            <w:tcW w:w="2006" w:type="dxa"/>
+            <w:tcW w:w="2019" w:type="dxa"/>
             <w:tcMar>
               <w:top w:w="40" w:type="dxa"/>
               <w:bottom w:w="40" w:type="dxa"/>
@@ -40452,7 +41730,7 @@
         </w:tc>
         <w:tc>
           <w:tcPr>
-            <w:tcW w:w="2063" w:type="dxa"/>
+            <w:tcW w:w="2048" w:type="dxa"/>
             <w:tcMar>
               <w:top w:w="40" w:type="dxa"/>
               <w:bottom w:w="40" w:type="dxa"/>
@@ -40478,7 +41756,7 @@
         </w:tc>
         <w:tc>
           <w:tcPr>
-            <w:tcW w:w="2532" w:type="dxa"/>
+            <w:tcW w:w="2527" w:type="dxa"/>
             <w:tcMar>
               <w:top w:w="40" w:type="dxa"/>
               <w:bottom w:w="40" w:type="dxa"/>
@@ -40505,7 +41783,7 @@
         </w:tc>
         <w:tc>
           <w:tcPr>
-            <w:tcW w:w="2468" w:type="dxa"/>
+            <w:tcW w:w="2475" w:type="dxa"/>
             <w:tcMar>
               <w:top w:w="40" w:type="dxa"/>
               <w:bottom w:w="40" w:type="dxa"/>
@@ -40624,7 +41902,7 @@
         </w:trPr>
         <w:tc>
           <w:tcPr>
-            <w:tcW w:w="2006" w:type="dxa"/>
+            <w:tcW w:w="2019" w:type="dxa"/>
             <w:tcMar>
               <w:top w:w="40" w:type="dxa"/>
               <w:bottom w:w="40" w:type="dxa"/>
@@ -40650,7 +41928,7 @@
         </w:tc>
         <w:tc>
           <w:tcPr>
-            <w:tcW w:w="2063" w:type="dxa"/>
+            <w:tcW w:w="2048" w:type="dxa"/>
             <w:tcMar>
               <w:top w:w="40" w:type="dxa"/>
               <w:bottom w:w="40" w:type="dxa"/>
@@ -40676,7 +41954,7 @@
         </w:tc>
         <w:tc>
           <w:tcPr>
-            <w:tcW w:w="2532" w:type="dxa"/>
+            <w:tcW w:w="2527" w:type="dxa"/>
             <w:tcMar>
               <w:top w:w="40" w:type="dxa"/>
               <w:bottom w:w="40" w:type="dxa"/>
@@ -40703,7 +41981,7 @@
         </w:tc>
         <w:tc>
           <w:tcPr>
-            <w:tcW w:w="2468" w:type="dxa"/>
+            <w:tcW w:w="2475" w:type="dxa"/>
             <w:tcMar>
               <w:top w:w="40" w:type="dxa"/>
               <w:bottom w:w="40" w:type="dxa"/>
@@ -40749,7 +42027,7 @@
         </w:trPr>
         <w:tc>
           <w:tcPr>
-            <w:tcW w:w="2006" w:type="dxa"/>
+            <w:tcW w:w="2019" w:type="dxa"/>
             <w:tcMar>
               <w:top w:w="40" w:type="dxa"/>
               <w:bottom w:w="40" w:type="dxa"/>
@@ -40775,7 +42053,7 @@
         </w:tc>
         <w:tc>
           <w:tcPr>
-            <w:tcW w:w="2063" w:type="dxa"/>
+            <w:tcW w:w="2048" w:type="dxa"/>
             <w:tcMar>
               <w:top w:w="40" w:type="dxa"/>
               <w:bottom w:w="40" w:type="dxa"/>
@@ -40801,7 +42079,7 @@
         </w:tc>
         <w:tc>
           <w:tcPr>
-            <w:tcW w:w="2532" w:type="dxa"/>
+            <w:tcW w:w="2527" w:type="dxa"/>
             <w:tcMar>
               <w:top w:w="40" w:type="dxa"/>
               <w:bottom w:w="40" w:type="dxa"/>
@@ -40828,7 +42106,7 @@
         </w:tc>
         <w:tc>
           <w:tcPr>
-            <w:tcW w:w="2468" w:type="dxa"/>
+            <w:tcW w:w="2475" w:type="dxa"/>
             <w:tcMar>
               <w:top w:w="40" w:type="dxa"/>
               <w:bottom w:w="40" w:type="dxa"/>
@@ -40859,7 +42137,7 @@
         </w:trPr>
         <w:tc>
           <w:tcPr>
-            <w:tcW w:w="2006" w:type="dxa"/>
+            <w:tcW w:w="2019" w:type="dxa"/>
             <w:tcMar>
               <w:top w:w="40" w:type="dxa"/>
               <w:bottom w:w="40" w:type="dxa"/>
@@ -40885,7 +42163,7 @@
         </w:tc>
         <w:tc>
           <w:tcPr>
-            <w:tcW w:w="2063" w:type="dxa"/>
+            <w:tcW w:w="2048" w:type="dxa"/>
             <w:tcMar>
               <w:top w:w="40" w:type="dxa"/>
               <w:bottom w:w="40" w:type="dxa"/>
@@ -40911,7 +42189,7 @@
         </w:tc>
         <w:tc>
           <w:tcPr>
-            <w:tcW w:w="2532" w:type="dxa"/>
+            <w:tcW w:w="2527" w:type="dxa"/>
             <w:tcMar>
               <w:top w:w="40" w:type="dxa"/>
               <w:bottom w:w="40" w:type="dxa"/>
@@ -40938,7 +42216,7 @@
         </w:tc>
         <w:tc>
           <w:tcPr>
-            <w:tcW w:w="2468" w:type="dxa"/>
+            <w:tcW w:w="2475" w:type="dxa"/>
             <w:tcMar>
               <w:top w:w="40" w:type="dxa"/>
               <w:bottom w:w="40" w:type="dxa"/>
@@ -41035,86 +42313,79 @@
         </w:trPr>
         <w:tc>
           <w:tcPr>
-            <w:tcW w:w="2006" w:type="dxa"/>
-            <w:tcMar>
-              <w:top w:w="40" w:type="dxa"/>
-              <w:bottom w:w="40" w:type="dxa"/>
-              <w:left w:w="70" w:type="dxa"/>
-              <w:right w:w="70" w:type="dxa"/>
-            </w:tcMar>
-          </w:tcPr>
-          <w:p>
-            <w:pPr>
-              <w:pStyle w:val="Compact"/>
-              <w:spacing w:line="240" w:lineRule="auto" w:before="0" w:after="0"/>
-              <w:ind w:firstLine="0"/>
-              <w:jc w:val="left"/>
-            </w:pPr>
-            <w:r>
-              <w:rPr>
-                <w:rFonts w:ascii="Arial" w:hAnsi="Arial"/>
-                <w:sz w:val="18"/>
-              </w:rPr>
-              <w:t xml:space="preserve">Máquina de medição</w:t>
-            </w:r>
-          </w:p>
-        </w:tc>
-        <w:tc>
-          <w:tcPr>
-            <w:tcW w:w="2063" w:type="dxa"/>
-            <w:tcMar>
-              <w:top w:w="40" w:type="dxa"/>
-              <w:bottom w:w="40" w:type="dxa"/>
-              <w:left w:w="70" w:type="dxa"/>
-              <w:right w:w="70" w:type="dxa"/>
-            </w:tcMar>
-          </w:tcPr>
-          <w:p>
-            <w:pPr>
-              <w:pStyle w:val="Compact"/>
-              <w:spacing w:line="240" w:lineRule="auto" w:before="0" w:after="0"/>
-              <w:ind w:firstLine="0"/>
-              <w:jc w:val="left"/>
-            </w:pPr>
-            <w:r>
-              <w:rPr>
-                <w:rFonts w:ascii="Arial" w:hAnsi="Arial"/>
-                <w:sz w:val="18"/>
-              </w:rPr>
-              <w:t xml:space="preserve">Linux sobre WSL2, Python 3.12.15, 32 núcleos lógicos</w:t>
-            </w:r>
-          </w:p>
-        </w:tc>
-        <w:tc>
-          <w:tcPr>
-            <w:tcW w:w="2532" w:type="dxa"/>
-            <w:tcMar>
-              <w:top w:w="40" w:type="dxa"/>
-              <w:bottom w:w="40" w:type="dxa"/>
-              <w:left w:w="70" w:type="dxa"/>
-              <w:right w:w="70" w:type="dxa"/>
-            </w:tcMar>
-          </w:tcPr>
-          <w:p>
-            <w:pPr>
-              <w:pStyle w:val="Compact"/>
-              <w:spacing w:line="240" w:lineRule="auto" w:before="0" w:after="0"/>
-              <w:ind w:firstLine="0"/>
-              <w:jc w:val="left"/>
-            </w:pPr>
-            <w:r>
-              <w:rPr>
-                <w:rFonts w:ascii="Arial" w:hAnsi="Arial"/>
-                <w:sz w:val="18"/>
-              </w:rPr>
-              <w:t xml:space="preserve">campo</w:t>
-            </w:r>
-            <w:r>
-              <w:rPr>
-                <w:rFonts w:ascii="Arial" w:hAnsi="Arial"/>
-                <w:sz w:val="18"/>
-              </w:rPr>
-              <w:t xml:space="preserve"> </w:t>
+            <w:tcW w:w="2019" w:type="dxa"/>
+            <w:tcMar>
+              <w:top w:w="40" w:type="dxa"/>
+              <w:bottom w:w="40" w:type="dxa"/>
+              <w:left w:w="70" w:type="dxa"/>
+              <w:right w:w="70" w:type="dxa"/>
+            </w:tcMar>
+          </w:tcPr>
+          <w:p>
+            <w:pPr>
+              <w:pStyle w:val="Compact"/>
+              <w:spacing w:line="240" w:lineRule="auto" w:before="0" w:after="0"/>
+              <w:ind w:firstLine="0"/>
+              <w:jc w:val="left"/>
+            </w:pPr>
+            <w:r>
+              <w:rPr>
+                <w:rFonts w:ascii="Arial" w:hAnsi="Arial"/>
+                <w:sz w:val="18"/>
+              </w:rPr>
+              <w:t xml:space="preserve">Repetição em contêiner (E1 a E3)</w:t>
+            </w:r>
+          </w:p>
+        </w:tc>
+        <w:tc>
+          <w:tcPr>
+            <w:tcW w:w="2048" w:type="dxa"/>
+            <w:tcMar>
+              <w:top w:w="40" w:type="dxa"/>
+              <w:bottom w:w="40" w:type="dxa"/>
+              <w:left w:w="70" w:type="dxa"/>
+              <w:right w:w="70" w:type="dxa"/>
+            </w:tcMar>
+          </w:tcPr>
+          <w:p>
+            <w:pPr>
+              <w:pStyle w:val="Compact"/>
+              <w:spacing w:line="240" w:lineRule="auto" w:before="0" w:after="0"/>
+              <w:ind w:firstLine="0"/>
+              <w:jc w:val="left"/>
+            </w:pPr>
+            <w:r>
+              <w:rPr>
+                <w:rFonts w:ascii="Arial" w:hAnsi="Arial"/>
+                <w:sz w:val="18"/>
+              </w:rPr>
+              <w:t xml:space="preserve">Tabela 26</w:t>
+            </w:r>
+          </w:p>
+        </w:tc>
+        <w:tc>
+          <w:tcPr>
+            <w:tcW w:w="2527" w:type="dxa"/>
+            <w:tcMar>
+              <w:top w:w="40" w:type="dxa"/>
+              <w:bottom w:w="40" w:type="dxa"/>
+              <w:left w:w="70" w:type="dxa"/>
+              <w:right w:w="70" w:type="dxa"/>
+            </w:tcMar>
+          </w:tcPr>
+          <w:p>
+            <w:pPr>
+              <w:pStyle w:val="Compact"/>
+              <w:spacing w:line="240" w:lineRule="auto" w:before="0" w:after="0"/>
+              <w:ind w:firstLine="0"/>
+              <w:jc w:val="left"/>
+            </w:pPr>
+            <w:r>
+              <w:rPr>
+                <w:rFonts w:ascii="Arial" w:hAnsi="Arial"/>
+                <w:sz w:val="18"/>
+              </w:rPr>
+              <w:t xml:space="preserve">saída de terminal dos autores (</w:t>
             </w:r>
             <w:r>
               <w:rPr>
@@ -41122,47 +42393,40 @@
                 <w:rFonts w:ascii="Arial" w:hAnsi="Arial"/>
                 <w:sz w:val="18"/>
               </w:rPr>
-              <w:t xml:space="preserve">maquina</w:t>
-            </w:r>
-            <w:r>
-              <w:rPr>
-                <w:rFonts w:ascii="Arial" w:hAnsi="Arial"/>
-                <w:sz w:val="18"/>
-              </w:rPr>
-              <w:t xml:space="preserve"> </w:t>
-            </w:r>
-            <w:r>
-              <w:rPr>
-                <w:rFonts w:ascii="Arial" w:hAnsi="Arial"/>
-                <w:sz w:val="18"/>
-              </w:rPr>
-              <w:t xml:space="preserve">de cada JSON</w:t>
-            </w:r>
-          </w:p>
-        </w:tc>
-        <w:tc>
-          <w:tcPr>
-            <w:tcW w:w="2468" w:type="dxa"/>
-            <w:tcMar>
-              <w:top w:w="40" w:type="dxa"/>
-              <w:bottom w:w="40" w:type="dxa"/>
-              <w:left w:w="70" w:type="dxa"/>
-              <w:right w:w="70" w:type="dxa"/>
-            </w:tcMar>
-          </w:tcPr>
-          <w:p>
-            <w:pPr>
-              <w:pStyle w:val="Compact"/>
-              <w:spacing w:line="240" w:lineRule="auto" w:before="0" w:after="0"/>
-              <w:ind w:firstLine="0"/>
-              <w:jc w:val="left"/>
-            </w:pPr>
-            <w:r>
-              <w:rPr>
-                <w:rFonts w:ascii="Arial" w:hAnsi="Arial"/>
-                <w:sz w:val="18"/>
-              </w:rPr>
-              <w:t xml:space="preserve">registrado pelo executor de ensaios</w:t>
+              <w:t xml:space="preserve">runs/repeticao/</w:t>
+            </w:r>
+            <w:r>
+              <w:rPr>
+                <w:rFonts w:ascii="Arial" w:hAnsi="Arial"/>
+                <w:sz w:val="18"/>
+              </w:rPr>
+              <w:t xml:space="preserve">, não versionado)</w:t>
+            </w:r>
+          </w:p>
+        </w:tc>
+        <w:tc>
+          <w:tcPr>
+            <w:tcW w:w="2475" w:type="dxa"/>
+            <w:tcMar>
+              <w:top w:w="40" w:type="dxa"/>
+              <w:bottom w:w="40" w:type="dxa"/>
+              <w:left w:w="70" w:type="dxa"/>
+              <w:right w:w="70" w:type="dxa"/>
+            </w:tcMar>
+          </w:tcPr>
+          <w:p>
+            <w:pPr>
+              <w:pStyle w:val="Compact"/>
+              <w:spacing w:line="240" w:lineRule="auto" w:before="0" w:after="0"/>
+              <w:ind w:firstLine="0"/>
+              <w:jc w:val="left"/>
+            </w:pPr>
+            <w:r>
+              <w:rPr>
+                <w:rFonts w:ascii="Arial" w:hAnsi="Arial"/>
+                <w:sz w:val="18"/>
+              </w:rPr>
+              <w:t xml:space="preserve">comando do Apêndice B, em 24/10/2026</w:t>
             </w:r>
           </w:p>
         </w:tc>
@@ -41173,106 +42437,134 @@
         </w:trPr>
         <w:tc>
           <w:tcPr>
-            <w:tcW w:w="2006" w:type="dxa"/>
-            <w:tcMar>
-              <w:top w:w="40" w:type="dxa"/>
-              <w:bottom w:w="40" w:type="dxa"/>
-              <w:left w:w="70" w:type="dxa"/>
-              <w:right w:w="70" w:type="dxa"/>
-            </w:tcMar>
-          </w:tcPr>
-          <w:p>
-            <w:pPr>
-              <w:pStyle w:val="Compact"/>
-              <w:spacing w:line="240" w:lineRule="auto" w:before="0" w:after="0"/>
-              <w:ind w:firstLine="0"/>
-              <w:jc w:val="left"/>
-            </w:pPr>
-            <w:r>
-              <w:rPr>
-                <w:rFonts w:ascii="Arial" w:hAnsi="Arial"/>
-                <w:sz w:val="18"/>
-              </w:rPr>
-              <w:t xml:space="preserve">Linhas de código por módulo</w:t>
-            </w:r>
-          </w:p>
-        </w:tc>
-        <w:tc>
-          <w:tcPr>
-            <w:tcW w:w="2063" w:type="dxa"/>
-            <w:tcMar>
-              <w:top w:w="40" w:type="dxa"/>
-              <w:bottom w:w="40" w:type="dxa"/>
-              <w:left w:w="70" w:type="dxa"/>
-              <w:right w:w="70" w:type="dxa"/>
-            </w:tcMar>
-          </w:tcPr>
-          <w:p>
-            <w:pPr>
-              <w:pStyle w:val="Compact"/>
-              <w:spacing w:line="240" w:lineRule="auto" w:before="0" w:after="0"/>
-              <w:ind w:firstLine="0"/>
-              <w:jc w:val="left"/>
-            </w:pPr>
-            <w:r>
-              <w:rPr>
-                <w:rFonts w:ascii="Arial" w:hAnsi="Arial"/>
-                <w:sz w:val="18"/>
-              </w:rPr>
-              <w:t xml:space="preserve">Tabela 7</w:t>
-            </w:r>
-          </w:p>
-        </w:tc>
-        <w:tc>
-          <w:tcPr>
-            <w:tcW w:w="2532" w:type="dxa"/>
-            <w:tcMar>
-              <w:top w:w="40" w:type="dxa"/>
-              <w:bottom w:w="40" w:type="dxa"/>
-              <w:left w:w="70" w:type="dxa"/>
-              <w:right w:w="70" w:type="dxa"/>
-            </w:tcMar>
-          </w:tcPr>
-          <w:p>
-            <w:pPr>
-              <w:pStyle w:val="Compact"/>
-              <w:spacing w:line="240" w:lineRule="auto" w:before="0" w:after="0"/>
-              <w:ind w:firstLine="0"/>
-              <w:jc w:val="left"/>
-            </w:pPr>
+            <w:tcW w:w="2019" w:type="dxa"/>
+            <w:tcMar>
+              <w:top w:w="40" w:type="dxa"/>
+              <w:bottom w:w="40" w:type="dxa"/>
+              <w:left w:w="70" w:type="dxa"/>
+              <w:right w:w="70" w:type="dxa"/>
+            </w:tcMar>
+          </w:tcPr>
+          <w:p>
+            <w:pPr>
+              <w:pStyle w:val="Compact"/>
+              <w:spacing w:line="240" w:lineRule="auto" w:before="0" w:after="0"/>
+              <w:ind w:firstLine="0"/>
+              <w:jc w:val="left"/>
+            </w:pPr>
+            <w:r>
+              <w:rPr>
+                <w:rFonts w:ascii="Arial" w:hAnsi="Arial"/>
+                <w:sz w:val="18"/>
+              </w:rPr>
+              <w:t xml:space="preserve">Máquina de medição</w:t>
+            </w:r>
+          </w:p>
+        </w:tc>
+        <w:tc>
+          <w:tcPr>
+            <w:tcW w:w="2048" w:type="dxa"/>
+            <w:tcMar>
+              <w:top w:w="40" w:type="dxa"/>
+              <w:bottom w:w="40" w:type="dxa"/>
+              <w:left w:w="70" w:type="dxa"/>
+              <w:right w:w="70" w:type="dxa"/>
+            </w:tcMar>
+          </w:tcPr>
+          <w:p>
+            <w:pPr>
+              <w:pStyle w:val="Compact"/>
+              <w:spacing w:line="240" w:lineRule="auto" w:before="0" w:after="0"/>
+              <w:ind w:firstLine="0"/>
+              <w:jc w:val="left"/>
+            </w:pPr>
+            <w:r>
+              <w:rPr>
+                <w:rFonts w:ascii="Arial" w:hAnsi="Arial"/>
+                <w:sz w:val="18"/>
+              </w:rPr>
+              <w:t xml:space="preserve">Linux sobre WSL2, Python 3.12.15, 32 núcleos lógicos</w:t>
+            </w:r>
+          </w:p>
+        </w:tc>
+        <w:tc>
+          <w:tcPr>
+            <w:tcW w:w="2527" w:type="dxa"/>
+            <w:tcMar>
+              <w:top w:w="40" w:type="dxa"/>
+              <w:bottom w:w="40" w:type="dxa"/>
+              <w:left w:w="70" w:type="dxa"/>
+              <w:right w:w="70" w:type="dxa"/>
+            </w:tcMar>
+          </w:tcPr>
+          <w:p>
+            <w:pPr>
+              <w:pStyle w:val="Compact"/>
+              <w:spacing w:line="240" w:lineRule="auto" w:before="0" w:after="0"/>
+              <w:ind w:firstLine="0"/>
+              <w:jc w:val="left"/>
+            </w:pPr>
+            <w:r>
+              <w:rPr>
+                <w:rFonts w:ascii="Arial" w:hAnsi="Arial"/>
+                <w:sz w:val="18"/>
+              </w:rPr>
+              <w:t xml:space="preserve">campo</w:t>
+            </w:r>
+            <w:r>
+              <w:rPr>
+                <w:rFonts w:ascii="Arial" w:hAnsi="Arial"/>
+                <w:sz w:val="18"/>
+              </w:rPr>
+              <w:t xml:space="preserve"> </w:t>
+            </w:r>
             <w:r>
               <w:rPr>
                 <w:rStyle w:val="VerbatimChar"/>
                 <w:rFonts w:ascii="Arial" w:hAnsi="Arial"/>
                 <w:sz w:val="18"/>
               </w:rPr>
-              <w:t xml:space="preserve">src/obd/</w:t>
-            </w:r>
-          </w:p>
-        </w:tc>
-        <w:tc>
-          <w:tcPr>
-            <w:tcW w:w="2468" w:type="dxa"/>
-            <w:tcMar>
-              <w:top w:w="40" w:type="dxa"/>
-              <w:bottom w:w="40" w:type="dxa"/>
-              <w:left w:w="70" w:type="dxa"/>
-              <w:right w:w="70" w:type="dxa"/>
-            </w:tcMar>
-          </w:tcPr>
-          <w:p>
-            <w:pPr>
-              <w:pStyle w:val="Compact"/>
-              <w:spacing w:line="240" w:lineRule="auto" w:before="0" w:after="0"/>
-              <w:ind w:firstLine="0"/>
-              <w:jc w:val="left"/>
-            </w:pPr>
-            <w:r>
-              <w:rPr>
-                <w:rFonts w:ascii="Arial" w:hAnsi="Arial"/>
-                <w:sz w:val="18"/>
-              </w:rPr>
-              <w:t xml:space="preserve">contagem de linhas dos arquivos de cada pasta, em 24/10/2026</w:t>
+              <w:t xml:space="preserve">maquina</w:t>
+            </w:r>
+            <w:r>
+              <w:rPr>
+                <w:rFonts w:ascii="Arial" w:hAnsi="Arial"/>
+                <w:sz w:val="18"/>
+              </w:rPr>
+              <w:t xml:space="preserve"> </w:t>
+            </w:r>
+            <w:r>
+              <w:rPr>
+                <w:rFonts w:ascii="Arial" w:hAnsi="Arial"/>
+                <w:sz w:val="18"/>
+              </w:rPr>
+              <w:t xml:space="preserve">de cada JSON</w:t>
+            </w:r>
+          </w:p>
+        </w:tc>
+        <w:tc>
+          <w:tcPr>
+            <w:tcW w:w="2475" w:type="dxa"/>
+            <w:tcMar>
+              <w:top w:w="40" w:type="dxa"/>
+              <w:bottom w:w="40" w:type="dxa"/>
+              <w:left w:w="70" w:type="dxa"/>
+              <w:right w:w="70" w:type="dxa"/>
+            </w:tcMar>
+          </w:tcPr>
+          <w:p>
+            <w:pPr>
+              <w:pStyle w:val="Compact"/>
+              <w:spacing w:line="240" w:lineRule="auto" w:before="0" w:after="0"/>
+              <w:ind w:firstLine="0"/>
+              <w:jc w:val="left"/>
+            </w:pPr>
+            <w:r>
+              <w:rPr>
+                <w:rFonts w:ascii="Arial" w:hAnsi="Arial"/>
+                <w:sz w:val="18"/>
+              </w:rPr>
+              <w:t xml:space="preserve">registrado pelo executor de ensaios</w:t>
             </w:r>
           </w:p>
         </w:tc>
@@ -41283,7 +42575,117 @@
         </w:trPr>
         <w:tc>
           <w:tcPr>
-            <w:tcW w:w="2006" w:type="dxa"/>
+            <w:tcW w:w="2019" w:type="dxa"/>
+            <w:tcMar>
+              <w:top w:w="40" w:type="dxa"/>
+              <w:bottom w:w="40" w:type="dxa"/>
+              <w:left w:w="70" w:type="dxa"/>
+              <w:right w:w="70" w:type="dxa"/>
+            </w:tcMar>
+          </w:tcPr>
+          <w:p>
+            <w:pPr>
+              <w:pStyle w:val="Compact"/>
+              <w:spacing w:line="240" w:lineRule="auto" w:before="0" w:after="0"/>
+              <w:ind w:firstLine="0"/>
+              <w:jc w:val="left"/>
+            </w:pPr>
+            <w:r>
+              <w:rPr>
+                <w:rFonts w:ascii="Arial" w:hAnsi="Arial"/>
+                <w:sz w:val="18"/>
+              </w:rPr>
+              <w:t xml:space="preserve">Linhas de código por módulo</w:t>
+            </w:r>
+          </w:p>
+        </w:tc>
+        <w:tc>
+          <w:tcPr>
+            <w:tcW w:w="2048" w:type="dxa"/>
+            <w:tcMar>
+              <w:top w:w="40" w:type="dxa"/>
+              <w:bottom w:w="40" w:type="dxa"/>
+              <w:left w:w="70" w:type="dxa"/>
+              <w:right w:w="70" w:type="dxa"/>
+            </w:tcMar>
+          </w:tcPr>
+          <w:p>
+            <w:pPr>
+              <w:pStyle w:val="Compact"/>
+              <w:spacing w:line="240" w:lineRule="auto" w:before="0" w:after="0"/>
+              <w:ind w:firstLine="0"/>
+              <w:jc w:val="left"/>
+            </w:pPr>
+            <w:r>
+              <w:rPr>
+                <w:rFonts w:ascii="Arial" w:hAnsi="Arial"/>
+                <w:sz w:val="18"/>
+              </w:rPr>
+              <w:t xml:space="preserve">Tabela 7</w:t>
+            </w:r>
+          </w:p>
+        </w:tc>
+        <w:tc>
+          <w:tcPr>
+            <w:tcW w:w="2527" w:type="dxa"/>
+            <w:tcMar>
+              <w:top w:w="40" w:type="dxa"/>
+              <w:bottom w:w="40" w:type="dxa"/>
+              <w:left w:w="70" w:type="dxa"/>
+              <w:right w:w="70" w:type="dxa"/>
+            </w:tcMar>
+          </w:tcPr>
+          <w:p>
+            <w:pPr>
+              <w:pStyle w:val="Compact"/>
+              <w:spacing w:line="240" w:lineRule="auto" w:before="0" w:after="0"/>
+              <w:ind w:firstLine="0"/>
+              <w:jc w:val="left"/>
+            </w:pPr>
+            <w:r>
+              <w:rPr>
+                <w:rStyle w:val="VerbatimChar"/>
+                <w:rFonts w:ascii="Arial" w:hAnsi="Arial"/>
+                <w:sz w:val="18"/>
+              </w:rPr>
+              <w:t xml:space="preserve">src/obd/</w:t>
+            </w:r>
+          </w:p>
+        </w:tc>
+        <w:tc>
+          <w:tcPr>
+            <w:tcW w:w="2475" w:type="dxa"/>
+            <w:tcMar>
+              <w:top w:w="40" w:type="dxa"/>
+              <w:bottom w:w="40" w:type="dxa"/>
+              <w:left w:w="70" w:type="dxa"/>
+              <w:right w:w="70" w:type="dxa"/>
+            </w:tcMar>
+          </w:tcPr>
+          <w:p>
+            <w:pPr>
+              <w:pStyle w:val="Compact"/>
+              <w:spacing w:line="240" w:lineRule="auto" w:before="0" w:after="0"/>
+              <w:ind w:firstLine="0"/>
+              <w:jc w:val="left"/>
+            </w:pPr>
+            <w:r>
+              <w:rPr>
+                <w:rFonts w:ascii="Arial" w:hAnsi="Arial"/>
+                <w:sz w:val="18"/>
+              </w:rPr>
+              <w:t xml:space="preserve">contagem de linhas dos arquivos de cada pasta, em 24/10/2026</w:t>
+            </w:r>
+          </w:p>
+        </w:tc>
+      </w:tr>
+      <w:tr>
+        <w:trPr>
+          <w:cantSplit/>
+        </w:trPr>
+        <w:tc>
+          <w:tcPr>
+            <w:tcW w:w="2019" w:type="dxa"/>
             <w:tcMar>
               <w:top w:w="40" w:type="dxa"/>
               <w:bottom w:w="40" w:type="dxa"/>
@@ -41309,7 +42711,7 @@
         </w:tc>
         <w:tc>
           <w:tcPr>
-            <w:tcW w:w="2063" w:type="dxa"/>
+            <w:tcW w:w="2048" w:type="dxa"/>
             <w:tcMar>
               <w:top w:w="40" w:type="dxa"/>
               <w:bottom w:w="40" w:type="dxa"/>
@@ -41335,7 +42737,7 @@
         </w:tc>
         <w:tc>
           <w:tcPr>
-            <w:tcW w:w="2532" w:type="dxa"/>
+            <w:tcW w:w="2527" w:type="dxa"/>
             <w:tcMar>
               <w:top w:w="40" w:type="dxa"/>
               <w:bottom w:w="40" w:type="dxa"/>
@@ -41440,7 +42842,7 @@
         </w:tc>
         <w:tc>
           <w:tcPr>
-            <w:tcW w:w="2468" w:type="dxa"/>
+            <w:tcW w:w="2475" w:type="dxa"/>
             <w:tcMar>
               <w:top w:w="40" w:type="dxa"/>
               <w:bottom w:w="40" w:type="dxa"/>
@@ -42068,7 +43470,200 @@
         <w:t xml:space="preserve">maquina</w:t>
       </w:r>
       <w:r>
-        <w:t xml:space="preserve">). Valores reais e erros de decodificação dependem só das sementes e devem coincidir; ciclo, RTT e latência dependem do sistema operacional e da CPU, e as diferenças devem ser declaradas. Essa comparação não foi realizada neste trabalho.</w:t>
+        <w:t xml:space="preserve">). Para repetir em contêiner isolado, na mesma máquina (foi o que se fez para E1 a E3):</w:t>
+      </w:r>
+    </w:p>
+    <w:p>
+      <w:pPr>
+        <w:pStyle w:val="SourceCode"/>
+      </w:pPr>
+      <w:r>
+        <w:rPr>
+          <w:rStyle w:val="BuiltInTok"/>
+        </w:rPr>
+        <w:t xml:space="preserve">export</w:t>
+      </w:r>
+      <w:r>
+        <w:rPr>
+          <w:rStyle w:val="NormalTok"/>
+        </w:rPr>
+        <w:t xml:space="preserve"> </w:t>
+      </w:r>
+      <w:r>
+        <w:rPr>
+          <w:rStyle w:val="VariableTok"/>
+        </w:rPr>
+        <w:t xml:space="preserve">MSYS_NO_PATHCONV</w:t>
+      </w:r>
+      <w:r>
+        <w:rPr>
+          <w:rStyle w:val="OperatorTok"/>
+        </w:rPr>
+        <w:t xml:space="preserve">=</w:t>
+      </w:r>
+      <w:r>
+        <w:rPr>
+          <w:rStyle w:val="NormalTok"/>
+        </w:rPr>
+        <w:t xml:space="preserve">1   </w:t>
+      </w:r>
+      <w:r>
+        <w:rPr>
+          <w:rStyle w:val="CommentTok"/>
+        </w:rPr>
+        <w:t xml:space="preserve"># só no Git Bash do Windows</w:t>
+      </w:r>
+      <w:r>
+        <w:br/>
+      </w:r>
+      <w:r>
+        <w:rPr>
+          <w:rStyle w:val="ExtensionTok"/>
+        </w:rPr>
+        <w:t xml:space="preserve">docker</w:t>
+      </w:r>
+      <w:r>
+        <w:rPr>
+          <w:rStyle w:val="NormalTok"/>
+        </w:rPr>
+        <w:t xml:space="preserve"> run </w:t>
+      </w:r>
+      <w:r>
+        <w:rPr>
+          <w:rStyle w:val="AttributeTok"/>
+        </w:rPr>
+        <w:t xml:space="preserve">--rm</w:t>
+      </w:r>
+      <w:r>
+        <w:rPr>
+          <w:rStyle w:val="NormalTok"/>
+        </w:rPr>
+        <w:t xml:space="preserve"> </w:t>
+      </w:r>
+      <w:r>
+        <w:rPr>
+          <w:rStyle w:val="AttributeTok"/>
+        </w:rPr>
+        <w:t xml:space="preserve">-v</w:t>
+      </w:r>
+      <w:r>
+        <w:rPr>
+          <w:rStyle w:val="NormalTok"/>
+        </w:rPr>
+        <w:t xml:space="preserve"> </w:t>
+      </w:r>
+      <w:r>
+        <w:rPr>
+          <w:rStyle w:val="StringTok"/>
+        </w:rPr>
+        <w:t xml:space="preserve">"</w:t>
+      </w:r>
+      <w:r>
+        <w:rPr>
+          <w:rStyle w:val="VariableTok"/>
+        </w:rPr>
+        <w:t xml:space="preserve">$(</w:t>
+      </w:r>
+      <w:r>
+        <w:rPr>
+          <w:rStyle w:val="BuiltInTok"/>
+        </w:rPr>
+        <w:t xml:space="preserve">pwd</w:t>
+      </w:r>
+      <w:r>
+        <w:rPr>
+          <w:rStyle w:val="NormalTok"/>
+        </w:rPr>
+        <w:t xml:space="preserve"> </w:t>
+      </w:r>
+      <w:r>
+        <w:rPr>
+          <w:rStyle w:val="AttributeTok"/>
+        </w:rPr>
+        <w:t xml:space="preserve">-W</w:t>
+      </w:r>
+      <w:r>
+        <w:rPr>
+          <w:rStyle w:val="VariableTok"/>
+        </w:rPr>
+        <w:t xml:space="preserve">)</w:t>
+      </w:r>
+      <w:r>
+        <w:rPr>
+          <w:rStyle w:val="StringTok"/>
+        </w:rPr>
+        <w:t xml:space="preserve">:/work"</w:t>
+      </w:r>
+      <w:r>
+        <w:rPr>
+          <w:rStyle w:val="NormalTok"/>
+        </w:rPr>
+        <w:t xml:space="preserve"> </w:t>
+      </w:r>
+      <w:r>
+        <w:rPr>
+          <w:rStyle w:val="AttributeTok"/>
+        </w:rPr>
+        <w:t xml:space="preserve">-w</w:t>
+      </w:r>
+      <w:r>
+        <w:rPr>
+          <w:rStyle w:val="NormalTok"/>
+        </w:rPr>
+        <w:t xml:space="preserve"> /work plataforma-de-telemetria-obd-ii-simulada-night </w:t>
+      </w:r>
+      <w:r>
+        <w:rPr>
+          <w:rStyle w:val="DataTypeTok"/>
+        </w:rPr>
+        <w:t xml:space="preserve">\</w:t>
+      </w:r>
+      <w:r>
+        <w:br/>
+      </w:r>
+      <w:r>
+        <w:rPr>
+          <w:rStyle w:val="NormalTok"/>
+        </w:rPr>
+        <w:t xml:space="preserve">  sh </w:t>
+      </w:r>
+      <w:r>
+        <w:rPr>
+          <w:rStyle w:val="AttributeTok"/>
+        </w:rPr>
+        <w:t xml:space="preserve">-c</w:t>
+      </w:r>
+      <w:r>
+        <w:rPr>
+          <w:rStyle w:val="NormalTok"/>
+        </w:rPr>
+        <w:t xml:space="preserve"> </w:t>
+      </w:r>
+      <w:r>
+        <w:rPr>
+          <w:rStyle w:val="StringTok"/>
+        </w:rPr>
+        <w:t xml:space="preserve">'pip install -e ".[dev]" -q &amp;&amp; python -m tests.benchmarks.e1 --out runs/repeticao &amp;&amp; python -m tests.benchmarks.e2 --out runs/repeticao &amp;&amp; python -m tests.benchmarks.e3 --out runs/repeticao'</w:t>
+      </w:r>
+    </w:p>
+    <w:p>
+      <w:pPr>
+        <w:pStyle w:val="FirstParagraph"/>
+      </w:pPr>
+      <w:r>
+        <w:t xml:space="preserve">O nome da imagem é o da imagem de desenvolvimento construída pelo</w:t>
+      </w:r>
+      <w:r>
+        <w:t xml:space="preserve"> </w:t>
+      </w:r>
+      <w:r>
+        <w:rPr>
+          <w:rStyle w:val="VerbatimChar"/>
+        </w:rPr>
+        <w:t xml:space="preserve">docker-compose.night.yml</w:t>
+      </w:r>
+      <w:r>
+        <w:t xml:space="preserve">. Valores reais e erros de decodificação dependem só das sementes e devem coincidir; ciclo, RTT e latência dependem do sistema operacional e da CPU, e as diferenças devem ser declaradas. A comparação com uma segunda máquina não foi realizada neste trabalho.</w:t>
       </w:r>
     </w:p>
     <w:bookmarkEnd w:id="159"/>
@@ -42170,7 +43765,7 @@
         <w:pStyle w:val="FirstParagraph"/>
       </w:pPr>
       <w:r>
-        <w:t xml:space="preserve">A Tabela 28 mostra uma sessão real, capturada em 24/10/2026 contra o servidor ELM327 do simulador (</w:t>
+        <w:t xml:space="preserve">A Tabela 29 mostra uma sessão real, capturada em 24/10/2026 contra o servidor ELM327 do simulador (</w:t>
       </w:r>
       <w:r>
         <w:rPr>
@@ -42232,7 +43827,7 @@
         <w:pStyle w:val="LegendaTabela"/>
       </w:pPr>
       <w:r>
-        <w:t xml:space="preserve">Tabela 28: Sessão ELM327 capturada contra o simulador</w:t>
+        <w:t xml:space="preserve">Tabela 29: Sessão ELM327 capturada contra o simulador</w:t>
       </w:r>
     </w:p>
     <w:tbl>
@@ -43878,7 +45473,7 @@
         <w:t xml:space="preserve">docs/duvidas.md</w:t>
       </w:r>
       <w:r>
-        <w:t xml:space="preserve">, tarefa por tarefa. A Tabela 29 seleciona as que mais afetam os resultados ou a interpretação deles.</w:t>
+        <w:t xml:space="preserve">, tarefa por tarefa. A Tabela 30 seleciona as que mais afetam os resultados ou a interpretação deles.</w:t>
       </w:r>
     </w:p>
     <w:p>
@@ -43886,7 +45481,7 @@
         <w:pStyle w:val="LegendaTabela"/>
       </w:pPr>
       <w:r>
-        <w:t xml:space="preserve">Tabela 29: Decisões de projeto selecionadas</w:t>
+        <w:t xml:space="preserve">Tabela 30: Decisões de projeto selecionadas</w:t>
       </w:r>
     </w:p>
     <w:tbl>

</xml_diff>